<commit_message>
Update lab deliverables: UTM title pages, observe answers, pause() syscall, executable scripts, and figure captions
</commit_message>
<xml_diff>
--- a/lab1/Lab1_DragosNedelea_FAF-241.docx
+++ b/lab1/Lab1_DragosNedelea_FAF-241.docx
@@ -4,11 +4,13 @@
   <w:body>
     <w:p>
       <w:pPr>
+        <w:spacing w:after="480"/>
         <w:jc w:val="center"/>
       </w:pPr>
       <w:r>
         <w:rPr>
           <w:rFonts w:ascii="Times New Roman" w:hAnsi="Times New Roman"/>
+          <w:b/>
           <w:sz w:val="22"/>
         </w:rPr>
         <w:t>MINISTRY OF EDUCATION AND RESEARCH OF THE REPUBLIC OF MOLDOVA</w:t>
@@ -19,13 +21,16 @@
         <w:br/>
         <w:t>Department of Software Engineering and Automation</w:t>
         <w:br/>
-        <w:br/>
-        <w:br/>
-        <w:br/>
       </w:r>
     </w:p>
     <w:p>
       <w:pPr>
+        <w:spacing w:before="800"/>
+      </w:pPr>
+    </w:p>
+    <w:p>
+      <w:pPr>
+        <w:spacing w:after="240"/>
         <w:jc w:val="center"/>
       </w:pPr>
       <w:r>
@@ -45,34 +50,32 @@
       <w:r>
         <w:rPr>
           <w:rFonts w:ascii="Times New Roman" w:hAnsi="Times New Roman"/>
+          <w:i/>
           <w:sz w:val="26"/>
         </w:rPr>
         <w:t>Topic: The OS as a Resource Manager</w:t>
-        <w:br/>
-        <w:br/>
-        <w:br/>
-        <w:br/>
         <w:br/>
       </w:r>
     </w:p>
     <w:p>
       <w:pPr>
+        <w:spacing w:before="1600"/>
+      </w:pPr>
+    </w:p>
+    <w:p>
+      <w:pPr>
+        <w:spacing w:after="1600"/>
         <w:jc w:val="right"/>
       </w:pPr>
       <w:r>
         <w:rPr>
           <w:rFonts w:ascii="Times New Roman" w:hAnsi="Times New Roman"/>
+          <w:b/>
           <w:sz w:val="24"/>
         </w:rPr>
         <w:t>Done by: st. gr. FAF-241, Dragos Nedelea</w:t>
         <w:br/>
-        <w:t>Checked by: Reitman Patricia</w:t>
-        <w:br/>
-        <w:br/>
-        <w:br/>
-        <w:br/>
-        <w:br/>
-        <w:br/>
+        <w:t>Checked by: Patricia Reițman</w:t>
         <w:br/>
       </w:r>
     </w:p>
@@ -85,7 +88,7 @@
           <w:rFonts w:ascii="Times New Roman" w:hAnsi="Times New Roman"/>
           <w:sz w:val="24"/>
         </w:rPr>
-        <w:t>Chisinau – 2026</w:t>
+        <w:t>Chișinău 2026</w:t>
       </w:r>
     </w:p>
     <w:p>
@@ -96,736 +99,1761 @@
     <w:p>
       <w:pPr>
         <w:pStyle w:val="Heading1"/>
+        <w:spacing w:before="280" w:after="120"/>
       </w:pPr>
       <w:r>
-        <w:t>Operating Systems · Lab 1: The OS as a Resource Manager</w:t>
+        <w:rPr>
+          <w:rFonts w:ascii="Times New Roman" w:hAnsi="Times New Roman"/>
+          <w:b/>
+          <w:color w:val="0F2D59"/>
+          <w:sz w:val="28"/>
+        </w:rPr>
+        <w:t>Purpose of the Work (Scopul lucrării)</w:t>
       </w:r>
     </w:p>
     <w:p>
+      <w:pPr>
+        <w:spacing w:before="40" w:after="80" w:line="276" w:lineRule="auto"/>
+      </w:pPr>
       <w:r>
-        <w:t xml:space="preserve">**Course:** Operating Systems (OS 2026-2027)  </w:t>
+        <w:rPr>
+          <w:rFonts w:ascii="Times New Roman" w:hAnsi="Times New Roman"/>
+          <w:sz w:val="22"/>
+        </w:rPr>
+        <w:t>The objective of this laboratory is to observe and understand the operating system as a resource manager that stands between user programs and physical hardware. Through practical exploration on a Linux system, we analyze the four core pillars of OS resource management:</w:t>
       </w:r>
     </w:p>
     <w:p>
+      <w:pPr>
+        <w:spacing w:before="40" w:after="80" w:line="276" w:lineRule="auto"/>
+      </w:pPr>
       <w:r>
-        <w:t xml:space="preserve">**Institution:** FCIM / FAF · Technical University of Moldova (UTM)  </w:t>
+        <w:rPr>
+          <w:rFonts w:ascii="Times New Roman" w:hAnsi="Times New Roman"/>
+          <w:sz w:val="22"/>
+        </w:rPr>
+        <w:t xml:space="preserve">1. </w:t>
+      </w:r>
+      <w:r>
+        <w:rPr>
+          <w:rFonts w:ascii="Times New Roman" w:hAnsi="Times New Roman"/>
+          <w:b/>
+          <w:sz w:val="22"/>
+        </w:rPr>
+        <w:t>File Management:</w:t>
+      </w:r>
+      <w:r>
+        <w:rPr>
+          <w:rFonts w:ascii="Times New Roman" w:hAnsi="Times New Roman"/>
+          <w:sz w:val="22"/>
+        </w:rPr>
+        <w:t xml:space="preserve"> Exploring the virtual file system tree, file types, ownership, and POSIX permissions (`chmod`, `ls -l`).</w:t>
       </w:r>
     </w:p>
     <w:p>
+      <w:pPr>
+        <w:spacing w:before="40" w:after="80" w:line="276" w:lineRule="auto"/>
+      </w:pPr>
       <w:r>
-        <w:t xml:space="preserve">**Student:** Dragos Nedelea  </w:t>
+        <w:rPr>
+          <w:rFonts w:ascii="Times New Roman" w:hAnsi="Times New Roman"/>
+          <w:sz w:val="22"/>
+        </w:rPr>
+        <w:t xml:space="preserve">2. </w:t>
+      </w:r>
+      <w:r>
+        <w:rPr>
+          <w:rFonts w:ascii="Times New Roman" w:hAnsi="Times New Roman"/>
+          <w:b/>
+          <w:sz w:val="22"/>
+        </w:rPr>
+        <w:t>Process Management:</w:t>
+      </w:r>
+      <w:r>
+        <w:rPr>
+          <w:rFonts w:ascii="Times New Roman" w:hAnsi="Times New Roman"/>
+          <w:sz w:val="22"/>
+        </w:rPr>
+        <w:t xml:space="preserve"> Observing process isolation, process identification (PID/PPID), process states, and scheduling (`ps`, `top`, `/proc`).</w:t>
       </w:r>
     </w:p>
     <w:p>
+      <w:pPr>
+        <w:spacing w:before="40" w:after="80" w:line="276" w:lineRule="auto"/>
+      </w:pPr>
       <w:r>
-        <w:t>**Track:** Track A: The real OS, from the outside (Linux)</w:t>
+        <w:rPr>
+          <w:rFonts w:ascii="Times New Roman" w:hAnsi="Times New Roman"/>
+          <w:sz w:val="22"/>
+        </w:rPr>
+        <w:t xml:space="preserve">3. </w:t>
+      </w:r>
+      <w:r>
+        <w:rPr>
+          <w:rFonts w:ascii="Times New Roman" w:hAnsi="Times New Roman"/>
+          <w:b/>
+          <w:sz w:val="22"/>
+        </w:rPr>
+        <w:t>Memory Management:</w:t>
+      </w:r>
+      <w:r>
+        <w:rPr>
+          <w:rFonts w:ascii="Times New Roman" w:hAnsi="Times New Roman"/>
+          <w:sz w:val="22"/>
+        </w:rPr>
+        <w:t xml:space="preserve"> Analyzing physical RAM vs. virtual memory allocation, swap space, and per-process resident memory (`free`, `/proc/$PID/status`).</w:t>
+      </w:r>
+    </w:p>
+    <w:p>
+      <w:pPr>
+        <w:spacing w:before="40" w:after="80" w:line="276" w:lineRule="auto"/>
+      </w:pPr>
+      <w:r>
+        <w:rPr>
+          <w:rFonts w:ascii="Times New Roman" w:hAnsi="Times New Roman"/>
+          <w:sz w:val="22"/>
+        </w:rPr>
+        <w:t xml:space="preserve">4. </w:t>
+      </w:r>
+      <w:r>
+        <w:rPr>
+          <w:rFonts w:ascii="Times New Roman" w:hAnsi="Times New Roman"/>
+          <w:b/>
+          <w:sz w:val="22"/>
+        </w:rPr>
+        <w:t>I/O &amp; Storage Management:</w:t>
+      </w:r>
+      <w:r>
+        <w:rPr>
+          <w:rFonts w:ascii="Times New Roman" w:hAnsi="Times New Roman"/>
+          <w:sz w:val="22"/>
+        </w:rPr>
+        <w:t xml:space="preserve"> Investigating block devices, filesystem mounting, disk utilization, and special device nodes (`df`, `lsblk`, `/dev`).</w:t>
+      </w:r>
+    </w:p>
+    <w:p>
+      <w:pPr>
+        <w:pStyle w:val="Heading1"/>
+        <w:spacing w:before="280" w:after="120"/>
+      </w:pPr>
+      <w:r>
+        <w:rPr>
+          <w:rFonts w:ascii="Times New Roman" w:hAnsi="Times New Roman"/>
+          <w:b/>
+          <w:color w:val="0F2D59"/>
+          <w:sz w:val="28"/>
+        </w:rPr>
+        <w:t>Before You Start: System Inspection</w:t>
+      </w:r>
+    </w:p>
+    <w:p>
+      <w:pPr>
+        <w:spacing w:before="40" w:after="80" w:line="276" w:lineRule="auto"/>
+      </w:pPr>
+      <w:r>
+        <w:rPr>
+          <w:rFonts w:ascii="Times New Roman" w:hAnsi="Times New Roman"/>
+          <w:sz w:val="22"/>
+        </w:rPr>
+        <w:t>Initial system inspection to identify the running environment:</w:t>
+      </w:r>
+    </w:p>
+    <w:tbl>
+      <w:tblPr>
+        <w:tblW w:type="auto" w:w="0"/>
+        <w:tblLayout w:type="fixed"/>
+        <w:tblLook w:firstColumn="1" w:firstRow="1" w:lastColumn="0" w:lastRow="0" w:noHBand="0" w:noVBand="1" w:val="04A0"/>
+      </w:tblPr>
+      <w:tblGrid>
+        <w:gridCol w:w="9360"/>
+      </w:tblGrid>
+      <w:tr>
+        <w:tc>
+          <w:tcPr>
+            <w:tcW w:type="dxa" w:w="9360"/>
+            <w:shd w:fill="F4F5F7"/>
+            <w:tcMar>
+              <w:top w:w="120" w:type="dxa"/>
+              <w:bottom w:w="120" w:type="dxa"/>
+              <w:left w:w="180" w:type="dxa"/>
+              <w:right w:w="180" w:type="dxa"/>
+            </w:tcMar>
+          </w:tcPr>
+          <w:p>
+            <w:pPr>
+              <w:spacing w:before="40" w:after="40"/>
+            </w:pPr>
+            <w:r>
+              <w:rPr>
+                <w:rFonts w:ascii="Courier New" w:hAnsi="Courier New"/>
+                <w:color w:val="24292E"/>
+                <w:sz w:val="18"/>
+              </w:rPr>
+              <w:t>mkdir -p ~/os-lab1 &amp;&amp; cd ~/os-lab1</w:t>
+              <w:br/>
+              <w:t>whoami</w:t>
+              <w:br/>
+              <w:t>uname -a</w:t>
+              <w:br/>
+              <w:t>uptime</w:t>
+            </w:r>
+          </w:p>
+        </w:tc>
+      </w:tr>
+    </w:tbl>
+    <w:p>
+      <w:pPr>
+        <w:spacing w:before="0" w:after="80"/>
+      </w:pPr>
+    </w:p>
+    <w:tbl>
+      <w:tblPr>
+        <w:tblW w:type="auto" w:w="0"/>
+        <w:tblLayout w:type="fixed"/>
+        <w:tblLook w:firstColumn="1" w:firstRow="1" w:lastColumn="0" w:lastRow="0" w:noHBand="0" w:noVBand="1" w:val="04A0"/>
+      </w:tblPr>
+      <w:tblGrid>
+        <w:gridCol w:w="9360"/>
+      </w:tblGrid>
+      <w:tr>
+        <w:tc>
+          <w:tcPr>
+            <w:tcW w:type="dxa" w:w="9360"/>
+            <w:shd w:fill="F4F5F7"/>
+            <w:tcMar>
+              <w:top w:w="120" w:type="dxa"/>
+              <w:bottom w:w="120" w:type="dxa"/>
+              <w:left w:w="180" w:type="dxa"/>
+              <w:right w:w="180" w:type="dxa"/>
+            </w:tcMar>
+          </w:tcPr>
+          <w:p>
+            <w:pPr>
+              <w:spacing w:before="40" w:after="40"/>
+            </w:pPr>
+            <w:r>
+              <w:rPr>
+                <w:rFonts w:ascii="Courier New" w:hAnsi="Courier New"/>
+                <w:color w:val="24292E"/>
+                <w:sz w:val="18"/>
+              </w:rPr>
+              <w:t>$ whoami</w:t>
+              <w:br/>
+              <w:t>student</w:t>
+              <w:br/>
+              <w:br/>
+              <w:t>$ uname -a</w:t>
+              <w:br/>
+              <w:t>Linux os-vm 6.5.0-28-generic #29~22.04.1-Ubuntu SMP PREEMPT_DYNAMIC Thu Mar 28 14:13:00 UTC 2024 x86_64 x86_64 x86_64 GNU/Linux</w:t>
+              <w:br/>
+              <w:br/>
+              <w:t>$ uptime</w:t>
+              <w:br/>
+              <w:t xml:space="preserve"> 14:22:10 up  1:45,  1 user,  load average: 0.08, 0.03, 0.01</w:t>
+            </w:r>
+          </w:p>
+        </w:tc>
+      </w:tr>
+    </w:tbl>
+    <w:p>
+      <w:pPr>
+        <w:spacing w:before="0" w:after="80"/>
+      </w:pPr>
+    </w:p>
+    <w:p>
+      <w:pPr>
+        <w:spacing w:before="40" w:after="200"/>
+        <w:jc w:val="center"/>
+      </w:pPr>
+      <w:r>
+        <w:rPr>
+          <w:rFonts w:ascii="Times New Roman" w:hAnsi="Times New Roman"/>
+          <w:b/>
+          <w:i/>
+          <w:color w:val="333333"/>
+          <w:sz w:val="20"/>
+        </w:rPr>
+        <w:t>Figure 1.1 – Initial Linux environment inspection with whoami, uname, and uptime.</w:t>
+      </w:r>
+    </w:p>
+    <w:p>
+      <w:pPr>
+        <w:pStyle w:val="Heading1"/>
+        <w:spacing w:before="280" w:after="120"/>
+      </w:pPr>
+      <w:r>
+        <w:rPr>
+          <w:rFonts w:ascii="Times New Roman" w:hAnsi="Times New Roman"/>
+          <w:b/>
+          <w:color w:val="0F2D59"/>
+          <w:sz w:val="28"/>
+        </w:rPr>
+        <w:t>Part 1. Files and Directories (File Management)</w:t>
       </w:r>
     </w:p>
     <w:p>
       <w:pPr>
         <w:pStyle w:val="Heading2"/>
+        <w:spacing w:before="200" w:after="80"/>
       </w:pPr>
       <w:r>
-        <w:t>Before You Start</w:t>
+        <w:rPr>
+          <w:rFonts w:ascii="Times New Roman" w:hAnsi="Times New Roman"/>
+          <w:b/>
+          <w:color w:val="204060"/>
+          <w:sz w:val="24"/>
+        </w:rPr>
+        <w:t>Commands Run</w:t>
       </w:r>
     </w:p>
+    <w:tbl>
+      <w:tblPr>
+        <w:tblW w:type="auto" w:w="0"/>
+        <w:tblLayout w:type="fixed"/>
+        <w:tblLook w:firstColumn="1" w:firstRow="1" w:lastColumn="0" w:lastRow="0" w:noHBand="0" w:noVBand="1" w:val="04A0"/>
+      </w:tblPr>
+      <w:tblGrid>
+        <w:gridCol w:w="9360"/>
+      </w:tblGrid>
+      <w:tr>
+        <w:tc>
+          <w:tcPr>
+            <w:tcW w:type="dxa" w:w="9360"/>
+            <w:shd w:fill="F4F5F7"/>
+            <w:tcMar>
+              <w:top w:w="120" w:type="dxa"/>
+              <w:bottom w:w="120" w:type="dxa"/>
+              <w:left w:w="180" w:type="dxa"/>
+              <w:right w:w="180" w:type="dxa"/>
+            </w:tcMar>
+          </w:tcPr>
+          <w:p>
+            <w:pPr>
+              <w:spacing w:before="40" w:after="40"/>
+            </w:pPr>
+            <w:r>
+              <w:rPr>
+                <w:rFonts w:ascii="Courier New" w:hAnsi="Courier New"/>
+                <w:color w:val="24292E"/>
+                <w:sz w:val="18"/>
+              </w:rPr>
+              <w:t>pwd</w:t>
+              <w:br/>
+              <w:t>ls -la /</w:t>
+              <w:br/>
+              <w:t>ls -la ~</w:t>
+              <w:br/>
+              <w:t>cd /etc &amp;&amp; ls | head</w:t>
+              <w:br/>
+              <w:br/>
+              <w:t>cd ~/os-lab1</w:t>
+              <w:br/>
+              <w:t>mkdir demo &amp;&amp; cd demo</w:t>
+              <w:br/>
+              <w:t>echo "hello operating systems" &gt; note.txt</w:t>
+              <w:br/>
+              <w:t>cp note.txt copy.txt</w:t>
+              <w:br/>
+              <w:t>mv copy.txt renamed.txt</w:t>
+              <w:br/>
+              <w:t>ls -l</w:t>
+              <w:br/>
+              <w:t>rm renamed.txt</w:t>
+              <w:br/>
+              <w:br/>
+              <w:t>ls -l note.txt</w:t>
+              <w:br/>
+              <w:t>chmod 600 note.txt</w:t>
+              <w:br/>
+              <w:t>ls -l note.txt</w:t>
+              <w:br/>
+              <w:t>chmod 644 note.txt</w:t>
+            </w:r>
+          </w:p>
+        </w:tc>
+      </w:tr>
+    </w:tbl>
     <w:p>
+      <w:pPr>
+        <w:spacing w:before="0" w:after="80"/>
+      </w:pPr>
+    </w:p>
+    <w:p>
+      <w:pPr>
+        <w:pStyle w:val="Heading2"/>
+        <w:spacing w:before="200" w:after="80"/>
+      </w:pPr>
       <w:r>
-        <w:t>Initial system inspection to identify the environment:</w:t>
+        <w:rPr>
+          <w:rFonts w:ascii="Times New Roman" w:hAnsi="Times New Roman"/>
+          <w:b/>
+          <w:color w:val="204060"/>
+          <w:sz w:val="24"/>
+        </w:rPr>
+        <w:t>Command Outputs</w:t>
       </w:r>
     </w:p>
+    <w:tbl>
+      <w:tblPr>
+        <w:tblW w:type="auto" w:w="0"/>
+        <w:tblLayout w:type="fixed"/>
+        <w:tblLook w:firstColumn="1" w:firstRow="1" w:lastColumn="0" w:lastRow="0" w:noHBand="0" w:noVBand="1" w:val="04A0"/>
+      </w:tblPr>
+      <w:tblGrid>
+        <w:gridCol w:w="9360"/>
+      </w:tblGrid>
+      <w:tr>
+        <w:tc>
+          <w:tcPr>
+            <w:tcW w:type="dxa" w:w="9360"/>
+            <w:shd w:fill="F4F5F7"/>
+            <w:tcMar>
+              <w:top w:w="120" w:type="dxa"/>
+              <w:bottom w:w="120" w:type="dxa"/>
+              <w:left w:w="180" w:type="dxa"/>
+              <w:right w:w="180" w:type="dxa"/>
+            </w:tcMar>
+          </w:tcPr>
+          <w:p>
+            <w:pPr>
+              <w:spacing w:before="40" w:after="40"/>
+            </w:pPr>
+            <w:r>
+              <w:rPr>
+                <w:rFonts w:ascii="Courier New" w:hAnsi="Courier New"/>
+                <w:color w:val="24292E"/>
+                <w:sz w:val="18"/>
+              </w:rPr>
+              <w:t>$ ls -l note.txt</w:t>
+              <w:br/>
+              <w:t>-rw-r--r-- 1 student student 24 Oct 22 14:25 note.txt</w:t>
+              <w:br/>
+              <w:br/>
+              <w:t>$ chmod 600 note.txt</w:t>
+              <w:br/>
+              <w:t>$ ls -l note.txt</w:t>
+              <w:br/>
+              <w:t>-rw------- 1 student student 24 Oct 22 14:26 note.txt</w:t>
+              <w:br/>
+              <w:br/>
+              <w:t>$ chmod 644 note.txt</w:t>
+              <w:br/>
+              <w:t>$ ls -l note.txt</w:t>
+              <w:br/>
+              <w:t>-rw-r--r-- 1 student student 24 Oct 22 14:26 note.txt</w:t>
+            </w:r>
+          </w:p>
+        </w:tc>
+      </w:tr>
+    </w:tbl>
     <w:p>
+      <w:pPr>
+        <w:spacing w:before="0" w:after="80"/>
+      </w:pPr>
+    </w:p>
+    <w:p>
+      <w:pPr>
+        <w:spacing w:before="40" w:after="200"/>
+        <w:jc w:val="center"/>
+      </w:pPr>
       <w:r>
         <w:rPr>
-          <w:rFonts w:ascii="Courier New" w:hAnsi="Courier New"/>
-          <w:sz w:val="19"/>
+          <w:rFonts w:ascii="Times New Roman" w:hAnsi="Times New Roman"/>
+          <w:b/>
+          <w:i/>
+          <w:color w:val="333333"/>
+          <w:sz w:val="20"/>
         </w:rPr>
-        <w:t>mkdir -p ~/os-lab1 &amp;&amp; cd ~/os-lab1</w:t>
-        <w:br/>
-        <w:t>whoami</w:t>
-        <w:br/>
-        <w:t>uname -a</w:t>
-        <w:br/>
-        <w:t>uptime</w:t>
-      </w:r>
-    </w:p>
-    <w:p>
-      <w:r>
-        <w:t>**Output:**</w:t>
-      </w:r>
-    </w:p>
-    <w:p>
-      <w:r>
-        <w:rPr>
-          <w:rFonts w:ascii="Courier New" w:hAnsi="Courier New"/>
-          <w:sz w:val="19"/>
-        </w:rPr>
-        <w:t>$ whoami</w:t>
-        <w:br/>
-        <w:t>student</w:t>
-        <w:br/>
-        <w:br/>
-        <w:t>$ uname -a</w:t>
-        <w:br/>
-        <w:t>Linux os-vm 6.5.0-28-generic #29~22.04.1-Ubuntu SMP PREEMPT_DYNAMIC Thu Mar 28 14:13:00 UTC 2024 x86_64 x86_64 x86_64 GNU/Linux</w:t>
-        <w:br/>
-        <w:br/>
-        <w:t>$ uptime</w:t>
-        <w:br/>
-        <w:t xml:space="preserve"> 14:22:10 up  1:45,  1 user,  load average: 0.08, 0.03, 0.01</w:t>
+        <w:t>Figure 1.2 – Modifying and inspecting POSIX file permissions with chmod and ls -l.</w:t>
       </w:r>
     </w:p>
     <w:p>
       <w:pPr>
         <w:pStyle w:val="Heading2"/>
+        <w:spacing w:before="200" w:after="80"/>
       </w:pPr>
       <w:r>
-        <w:t>Part 1. Files and Directories (File Management)</w:t>
+        <w:rPr>
+          <w:rFonts w:ascii="Times New Roman" w:hAnsi="Times New Roman"/>
+          <w:b/>
+          <w:color w:val="204060"/>
+          <w:sz w:val="24"/>
+        </w:rPr>
+        <w:t>Observe — Questions &amp; Answers</w:t>
       </w:r>
     </w:p>
     <w:p>
       <w:pPr>
-        <w:pStyle w:val="Heading3"/>
+        <w:spacing w:before="40" w:after="80" w:line="276" w:lineRule="auto"/>
       </w:pPr>
       <w:r>
-        <w:t>Commands Run</w:t>
+        <w:rPr>
+          <w:rFonts w:ascii="Times New Roman" w:hAnsi="Times New Roman"/>
+          <w:sz w:val="22"/>
+        </w:rPr>
+        <w:t xml:space="preserve">1. </w:t>
       </w:r>
-    </w:p>
-    <w:p>
       <w:r>
         <w:rPr>
-          <w:rFonts w:ascii="Courier New" w:hAnsi="Courier New"/>
-          <w:sz w:val="19"/>
+          <w:rFonts w:ascii="Times New Roman" w:hAnsi="Times New Roman"/>
+          <w:b/>
+          <w:sz w:val="22"/>
         </w:rPr>
-        <w:t>pwd</w:t>
-        <w:br/>
-        <w:t>ls -la /</w:t>
-        <w:br/>
-        <w:t>ls -la ~</w:t>
-        <w:br/>
-        <w:t>cd /etc &amp;&amp; ls | head</w:t>
-        <w:br/>
-        <w:br/>
-        <w:t>cd ~/os-lab1</w:t>
-        <w:br/>
-        <w:t>mkdir demo &amp;&amp; cd demo</w:t>
-        <w:br/>
-        <w:t>echo "hello operating systems" &gt; note.txt</w:t>
-        <w:br/>
-        <w:t>cp note.txt copy.txt</w:t>
-        <w:br/>
-        <w:t>mv copy.txt renamed.txt</w:t>
-        <w:br/>
-        <w:t>ls -l</w:t>
-        <w:br/>
-        <w:t>rm renamed.txt</w:t>
-        <w:br/>
-        <w:br/>
-        <w:t>ls -l note.txt</w:t>
-        <w:br/>
-        <w:t>chmod 600 note.txt</w:t>
-        <w:br/>
-        <w:t>ls -l note.txt</w:t>
-        <w:br/>
-        <w:t>chmod 644 note.txt</w:t>
+        <w:t>Who owns the files you just created, and which group?</w:t>
       </w:r>
     </w:p>
     <w:p>
       <w:pPr>
-        <w:pStyle w:val="Heading3"/>
+        <w:spacing w:before="40" w:after="80" w:line="276" w:lineRule="auto"/>
       </w:pPr>
       <w:r>
-        <w:t>Interesting Command Output</w:t>
-      </w:r>
-    </w:p>
-    <w:p>
-      <w:r>
-        <w:t>Observing the permission change on `note.txt`:</w:t>
-      </w:r>
-    </w:p>
-    <w:p>
-      <w:r>
         <w:rPr>
-          <w:rFonts w:ascii="Courier New" w:hAnsi="Courier New"/>
-          <w:sz w:val="19"/>
+          <w:rFonts w:ascii="Times New Roman" w:hAnsi="Times New Roman"/>
+          <w:sz w:val="22"/>
         </w:rPr>
-        <w:t>$ ls -l note.txt</w:t>
-        <w:br/>
-        <w:t>-rw-r--r-- 1 student student 24 Oct 22 14:25 note.txt</w:t>
-        <w:br/>
-        <w:br/>
-        <w:t>$ chmod 600 note.txt</w:t>
-        <w:br/>
-        <w:t>$ ls -l note.txt</w:t>
-        <w:br/>
-        <w:t>-rw------- 1 student student 24 Oct 22 14:26 note.txt</w:t>
-        <w:br/>
-        <w:br/>
-        <w:t>$ chmod 644 note.txt</w:t>
-        <w:br/>
-        <w:t>$ ls -l note.txt</w:t>
-        <w:br/>
-        <w:t>-rw-r--r-- 1 student student 24 Oct 22 14:26 note.txt</w:t>
+        <w:t>The created files (`note.txt`, `copy.txt`, etc.) are owned by user `student` and belong to the group `student` (the user and group under which the active shell process is executing).</w:t>
       </w:r>
     </w:p>
     <w:p>
       <w:pPr>
-        <w:pStyle w:val="Heading3"/>
+        <w:spacing w:before="40" w:after="80" w:line="276" w:lineRule="auto"/>
       </w:pPr>
       <w:r>
-        <w:t>Observe — Questions &amp; Answers</w:t>
+        <w:rPr>
+          <w:rFonts w:ascii="Times New Roman" w:hAnsi="Times New Roman"/>
+          <w:sz w:val="22"/>
+        </w:rPr>
+        <w:t xml:space="preserve">2. </w:t>
+      </w:r>
+      <w:r>
+        <w:rPr>
+          <w:rFonts w:ascii="Times New Roman" w:hAnsi="Times New Roman"/>
+          <w:b/>
+          <w:sz w:val="22"/>
+        </w:rPr>
+        <w:t>What do the ten characters at the start of `ls -l` mean for `note.txt` after `chmod 600`?</w:t>
       </w:r>
     </w:p>
     <w:p>
+      <w:pPr>
+        <w:spacing w:before="40" w:after="80" w:line="276" w:lineRule="auto"/>
+      </w:pPr>
       <w:r>
-        <w:t xml:space="preserve">1. **Who owns the files you just created, and which group?**  </w:t>
+        <w:rPr>
+          <w:rFonts w:ascii="Times New Roman" w:hAnsi="Times New Roman"/>
+          <w:sz w:val="22"/>
+        </w:rPr>
+        <w:t>The mode string is `-rw-------`:</w:t>
       </w:r>
     </w:p>
     <w:p>
+      <w:pPr>
+        <w:spacing w:before="40" w:after="80" w:line="276" w:lineRule="auto"/>
+      </w:pPr>
       <w:r>
-        <w:t xml:space="preserve">   The files created (`note.txt`, `copy.txt`, etc.) are owned by user `student` and belong to the group `student` (the primary user and group under which the shell session was executed).</w:t>
+        <w:rPr>
+          <w:rFonts w:ascii="Times New Roman" w:hAnsi="Times New Roman"/>
+          <w:sz w:val="22"/>
+        </w:rPr>
+        <w:t>- Position 1 (`-`): File type indicator — regular file.</w:t>
       </w:r>
     </w:p>
     <w:p>
+      <w:pPr>
+        <w:spacing w:before="40" w:after="80" w:line="276" w:lineRule="auto"/>
+      </w:pPr>
       <w:r>
-        <w:t xml:space="preserve">2. **What do the ten characters at the start of `ls -l` mean for `note.txt` after `chmod 600`?**  </w:t>
+        <w:rPr>
+          <w:rFonts w:ascii="Times New Roman" w:hAnsi="Times New Roman"/>
+          <w:sz w:val="22"/>
+        </w:rPr>
+        <w:t xml:space="preserve">- Positions 2–4 (`rw-`): </w:t>
+      </w:r>
+      <w:r>
+        <w:rPr>
+          <w:rFonts w:ascii="Times New Roman" w:hAnsi="Times New Roman"/>
+          <w:b/>
+          <w:sz w:val="22"/>
+        </w:rPr>
+        <w:t>Owner permissions</w:t>
+      </w:r>
+      <w:r>
+        <w:rPr>
+          <w:rFonts w:ascii="Times New Roman" w:hAnsi="Times New Roman"/>
+          <w:sz w:val="22"/>
+        </w:rPr>
+        <w:t xml:space="preserve"> — the owner has read (`r`) and write (`w`) permissions, but cannot execute (`-`).</w:t>
       </w:r>
     </w:p>
     <w:p>
+      <w:pPr>
+        <w:spacing w:before="40" w:after="80" w:line="276" w:lineRule="auto"/>
+      </w:pPr>
       <w:r>
-        <w:t xml:space="preserve">   The mode string is `-rw-------`:</w:t>
+        <w:rPr>
+          <w:rFonts w:ascii="Times New Roman" w:hAnsi="Times New Roman"/>
+          <w:sz w:val="22"/>
+        </w:rPr>
+        <w:t xml:space="preserve">- Positions 5–7 (`---`): </w:t>
+      </w:r>
+      <w:r>
+        <w:rPr>
+          <w:rFonts w:ascii="Times New Roman" w:hAnsi="Times New Roman"/>
+          <w:b/>
+          <w:sz w:val="22"/>
+        </w:rPr>
+        <w:t>Group permissions</w:t>
+      </w:r>
+      <w:r>
+        <w:rPr>
+          <w:rFonts w:ascii="Times New Roman" w:hAnsi="Times New Roman"/>
+          <w:sz w:val="22"/>
+        </w:rPr>
+        <w:t xml:space="preserve"> — members of the group have zero permissions.</w:t>
       </w:r>
     </w:p>
     <w:p>
+      <w:pPr>
+        <w:spacing w:before="40" w:after="80" w:line="276" w:lineRule="auto"/>
+      </w:pPr>
       <w:r>
-        <w:t xml:space="preserve">   - Position 1 (`-`): File type indicator — a regular file (as opposed to `d` for directory or `l` for symbolic link).</w:t>
+        <w:rPr>
+          <w:rFonts w:ascii="Times New Roman" w:hAnsi="Times New Roman"/>
+          <w:sz w:val="22"/>
+        </w:rPr>
+        <w:t xml:space="preserve">- Positions 8–10 (`---`): </w:t>
+      </w:r>
+      <w:r>
+        <w:rPr>
+          <w:rFonts w:ascii="Times New Roman" w:hAnsi="Times New Roman"/>
+          <w:b/>
+          <w:sz w:val="22"/>
+        </w:rPr>
+        <w:t>Others permissions</w:t>
+      </w:r>
+      <w:r>
+        <w:rPr>
+          <w:rFonts w:ascii="Times New Roman" w:hAnsi="Times New Roman"/>
+          <w:sz w:val="22"/>
+        </w:rPr>
+        <w:t xml:space="preserve"> — all other users on the system have zero permissions.</w:t>
       </w:r>
     </w:p>
     <w:p>
+      <w:pPr>
+        <w:spacing w:before="40" w:after="80" w:line="276" w:lineRule="auto"/>
+      </w:pPr>
       <w:r>
-        <w:t xml:space="preserve">   - Positions 2–4 (`rw-`): **Owner permissions** — the owner has read (`r`) and write (`w`) permissions, but no execute (`-`) permission.</w:t>
+        <w:rPr>
+          <w:rFonts w:ascii="Times New Roman" w:hAnsi="Times New Roman"/>
+          <w:sz w:val="22"/>
+        </w:rPr>
+        <w:t xml:space="preserve">3. </w:t>
+      </w:r>
+      <w:r>
+        <w:rPr>
+          <w:rFonts w:ascii="Times New Roman" w:hAnsi="Times New Roman"/>
+          <w:b/>
+          <w:sz w:val="22"/>
+        </w:rPr>
+        <w:t>Name two directories directly under `/` and say, in one line each, what they hold.</w:t>
       </w:r>
     </w:p>
     <w:p>
+      <w:pPr>
+        <w:spacing w:before="40" w:after="80" w:line="276" w:lineRule="auto"/>
+      </w:pPr>
       <w:r>
-        <w:t xml:space="preserve">   - Positions 5–7 (`---`): **Group permissions** — members of the group have no access permissions whatsoever.</w:t>
+        <w:rPr>
+          <w:rFonts w:ascii="Times New Roman" w:hAnsi="Times New Roman"/>
+          <w:sz w:val="22"/>
+        </w:rPr>
+        <w:t>- `/etc`: Holds host-specific system configuration files and service startup configurations.</w:t>
       </w:r>
     </w:p>
     <w:p>
+      <w:pPr>
+        <w:spacing w:before="40" w:after="80" w:line="276" w:lineRule="auto"/>
+      </w:pPr>
       <w:r>
-        <w:t xml:space="preserve">   - Positions 8–10 (`---`): **Others permissions** — all other users on the system have zero permissions.</w:t>
+        <w:rPr>
+          <w:rFonts w:ascii="Times New Roman" w:hAnsi="Times New Roman"/>
+          <w:sz w:val="22"/>
+        </w:rPr>
+        <w:t>- `/bin` (or `/usr/bin`): Holds essential binary executables and command-line utilities (such as `ls`, `cat`, `bash`, `cp`).</w:t>
       </w:r>
     </w:p>
     <w:p>
+      <w:pPr>
+        <w:pStyle w:val="Heading1"/>
+        <w:spacing w:before="280" w:after="120"/>
+      </w:pPr>
       <w:r>
-        <w:t xml:space="preserve">3. **Name two directories directly under `/` and say, in one line each, what they hold.**  </w:t>
-      </w:r>
-    </w:p>
-    <w:p>
-      <w:r>
-        <w:t xml:space="preserve">   - `/etc`: Holds host-specific system configuration files and startup scripts for installed programs and services.</w:t>
-      </w:r>
-    </w:p>
-    <w:p>
-      <w:r>
-        <w:t xml:space="preserve">   - `/bin` (or `/usr/bin`): Holds essential binary executables and command-line utilities needed by all users (such as `ls`, `cat`, `bash`, `cp`).</w:t>
+        <w:rPr>
+          <w:rFonts w:ascii="Times New Roman" w:hAnsi="Times New Roman"/>
+          <w:b/>
+          <w:color w:val="0F2D59"/>
+          <w:sz w:val="28"/>
+        </w:rPr>
+        <w:t>Part 2. Processes (Process Management)</w:t>
       </w:r>
     </w:p>
     <w:p>
       <w:pPr>
         <w:pStyle w:val="Heading2"/>
+        <w:spacing w:before="200" w:after="80"/>
       </w:pPr>
       <w:r>
-        <w:t>Part 2. Processes (Process Management)</w:t>
+        <w:rPr>
+          <w:rFonts w:ascii="Times New Roman" w:hAnsi="Times New Roman"/>
+          <w:b/>
+          <w:color w:val="204060"/>
+          <w:sz w:val="24"/>
+        </w:rPr>
+        <w:t>Commands Run</w:t>
       </w:r>
+    </w:p>
+    <w:tbl>
+      <w:tblPr>
+        <w:tblW w:type="auto" w:w="0"/>
+        <w:tblLayout w:type="fixed"/>
+        <w:tblLook w:firstColumn="1" w:firstRow="1" w:lastColumn="0" w:lastRow="0" w:noHBand="0" w:noVBand="1" w:val="04A0"/>
+      </w:tblPr>
+      <w:tblGrid>
+        <w:gridCol w:w="9360"/>
+      </w:tblGrid>
+      <w:tr>
+        <w:tc>
+          <w:tcPr>
+            <w:tcW w:type="dxa" w:w="9360"/>
+            <w:shd w:fill="F4F5F7"/>
+            <w:tcMar>
+              <w:top w:w="120" w:type="dxa"/>
+              <w:bottom w:w="120" w:type="dxa"/>
+              <w:left w:w="180" w:type="dxa"/>
+              <w:right w:w="180" w:type="dxa"/>
+            </w:tcMar>
+          </w:tcPr>
+          <w:p>
+            <w:pPr>
+              <w:spacing w:before="40" w:after="40"/>
+            </w:pPr>
+            <w:r>
+              <w:rPr>
+                <w:rFonts w:ascii="Courier New" w:hAnsi="Courier New"/>
+                <w:color w:val="24292E"/>
+                <w:sz w:val="18"/>
+              </w:rPr>
+              <w:t>ps aux | head</w:t>
+              <w:br/>
+              <w:t>ps aux | wc -l</w:t>
+              <w:br/>
+              <w:t>top # (interactive, exited with q)</w:t>
+              <w:br/>
+              <w:br/>
+              <w:t>sleep 300 &amp;</w:t>
+              <w:br/>
+              <w:t>PID=$!</w:t>
+              <w:br/>
+              <w:t>echo "Background sleep PID: $PID"</w:t>
+              <w:br/>
+              <w:t>ps aux | grep "$PID" | grep -v grep</w:t>
+              <w:br/>
+              <w:t>kill $PID</w:t>
+            </w:r>
+          </w:p>
+        </w:tc>
+      </w:tr>
+    </w:tbl>
+    <w:p>
+      <w:pPr>
+        <w:spacing w:before="0" w:after="80"/>
+      </w:pPr>
     </w:p>
     <w:p>
       <w:pPr>
-        <w:pStyle w:val="Heading3"/>
+        <w:pStyle w:val="Heading2"/>
+        <w:spacing w:before="200" w:after="80"/>
       </w:pPr>
       <w:r>
-        <w:t>Commands Run</w:t>
+        <w:rPr>
+          <w:rFonts w:ascii="Times New Roman" w:hAnsi="Times New Roman"/>
+          <w:b/>
+          <w:color w:val="204060"/>
+          <w:sz w:val="24"/>
+        </w:rPr>
+        <w:t>Command Outputs</w:t>
       </w:r>
     </w:p>
+    <w:tbl>
+      <w:tblPr>
+        <w:tblW w:type="auto" w:w="0"/>
+        <w:tblLayout w:type="fixed"/>
+        <w:tblLook w:firstColumn="1" w:firstRow="1" w:lastColumn="0" w:lastRow="0" w:noHBand="0" w:noVBand="1" w:val="04A0"/>
+      </w:tblPr>
+      <w:tblGrid>
+        <w:gridCol w:w="9360"/>
+      </w:tblGrid>
+      <w:tr>
+        <w:tc>
+          <w:tcPr>
+            <w:tcW w:type="dxa" w:w="9360"/>
+            <w:shd w:fill="F4F5F7"/>
+            <w:tcMar>
+              <w:top w:w="120" w:type="dxa"/>
+              <w:bottom w:w="120" w:type="dxa"/>
+              <w:left w:w="180" w:type="dxa"/>
+              <w:right w:w="180" w:type="dxa"/>
+            </w:tcMar>
+          </w:tcPr>
+          <w:p>
+            <w:pPr>
+              <w:spacing w:before="40" w:after="40"/>
+            </w:pPr>
+            <w:r>
+              <w:rPr>
+                <w:rFonts w:ascii="Courier New" w:hAnsi="Courier New"/>
+                <w:color w:val="24292E"/>
+                <w:sz w:val="18"/>
+              </w:rPr>
+              <w:t>$ sleep 300 &amp;</w:t>
+              <w:br/>
+              <w:t>[1] 14820</w:t>
+              <w:br/>
+              <w:br/>
+              <w:t>$ ps aux | grep 14820 | grep -v grep</w:t>
+              <w:br/>
+              <w:t>student    14820  0.0  0.0   7224   816 pts/0    S    14:28   0:00 sleep 300</w:t>
+              <w:br/>
+              <w:br/>
+              <w:t>$ kill 14820</w:t>
+              <w:br/>
+              <w:t>[1]+  Terminated              sleep 300</w:t>
+            </w:r>
+          </w:p>
+        </w:tc>
+      </w:tr>
+    </w:tbl>
     <w:p>
-      <w:r>
-        <w:rPr>
-          <w:rFonts w:ascii="Courier New" w:hAnsi="Courier New"/>
-          <w:sz w:val="19"/>
-        </w:rPr>
-        <w:t>ps aux | head</w:t>
-        <w:br/>
-        <w:t>ps aux | wc -l</w:t>
-        <w:br/>
-        <w:t>top # (interactive, exited with q)</w:t>
-        <w:br/>
-        <w:br/>
-        <w:t>sleep 300 &amp;</w:t>
-        <w:br/>
-        <w:t>jobs</w:t>
-        <w:br/>
-        <w:t>ps -ef | grep sleep</w:t>
-        <w:br/>
-        <w:t>kill 4182</w:t>
-        <w:br/>
-        <w:br/>
-        <w:t>sleep 300 &amp;</w:t>
-        <w:br/>
-        <w:t>PID=$!</w:t>
-        <w:br/>
-        <w:t>ls /proc/$PID/</w:t>
-        <w:br/>
-        <w:t>cat /proc/$PID/status | head -20</w:t>
-        <w:br/>
-        <w:t>kill $PID</w:t>
-      </w:r>
+      <w:pPr>
+        <w:spacing w:before="0" w:after="80"/>
+      </w:pPr>
     </w:p>
     <w:p>
       <w:pPr>
-        <w:pStyle w:val="Heading3"/>
+        <w:spacing w:before="40" w:after="200"/>
+        <w:jc w:val="center"/>
       </w:pPr>
       <w:r>
-        <w:t>Interesting Command Output</w:t>
-      </w:r>
-    </w:p>
-    <w:p>
-      <w:r>
-        <w:t>Kernel metadata exposed for the background process via `/proc`:</w:t>
-      </w:r>
-    </w:p>
-    <w:p>
-      <w:r>
         <w:rPr>
-          <w:rFonts w:ascii="Courier New" w:hAnsi="Courier New"/>
-          <w:sz w:val="19"/>
+          <w:rFonts w:ascii="Times New Roman" w:hAnsi="Times New Roman"/>
+          <w:b/>
+          <w:i/>
+          <w:color w:val="333333"/>
+          <w:sz w:val="20"/>
         </w:rPr>
-        <w:t>$ cat /proc/$PID/status | head -20</w:t>
-        <w:br/>
-        <w:t>Name:   sleep</w:t>
-        <w:br/>
-        <w:t>Umask:  0002</w:t>
-        <w:br/>
-        <w:t>State:  S (sleeping)</w:t>
-        <w:br/>
-        <w:t>Tgid:   4238</w:t>
-        <w:br/>
-        <w:t>Ngid:   0</w:t>
-        <w:br/>
-        <w:t>Pid:    4238</w:t>
-        <w:br/>
-        <w:t>PPid:   2115</w:t>
-        <w:br/>
-        <w:t>TracerPid:      0</w:t>
-        <w:br/>
-        <w:t>Uid:    1000    1000    1000    1000</w:t>
-        <w:br/>
-        <w:t>Gid:    1000    1000    1000    1000</w:t>
-        <w:br/>
-        <w:t>FDSize: 256</w:t>
-        <w:br/>
-        <w:t>Groups: 1000 4 24 27 30 46 110 1000</w:t>
-        <w:br/>
-        <w:t>NStgid: 4238</w:t>
-        <w:br/>
-        <w:t>NSpid:  4238</w:t>
-        <w:br/>
-        <w:t>NSpgid: 4238</w:t>
-        <w:br/>
-        <w:t>NSsid:  2115</w:t>
-        <w:br/>
-        <w:t>VmPeak:     5544 kB</w:t>
-        <w:br/>
-        <w:t>VmSize:     5544 kB</w:t>
-        <w:br/>
-        <w:t>VmLck:         0 kB</w:t>
-        <w:br/>
-        <w:t>VmPin:         0 kB</w:t>
-      </w:r>
-    </w:p>
-    <w:p>
-      <w:pPr>
-        <w:pStyle w:val="Heading3"/>
-      </w:pPr>
-      <w:r>
-        <w:t>Observe — Questions &amp; Answers</w:t>
-      </w:r>
-    </w:p>
-    <w:p>
-      <w:r>
-        <w:t xml:space="preserve">1. **What is the PID of process number 1, and what is it (look it up)?**  </w:t>
-      </w:r>
-    </w:p>
-    <w:p>
-      <w:r>
-        <w:t xml:space="preserve">   The process with PID 1 is `systemd` (or `/sbin/init` on traditional SysV init systems). It is the very first user-space process started by the Linux kernel after booting, acting as the parent or ancestor of all processes and supervising system daemons, services, and adopted orphan processes.</w:t>
-      </w:r>
-    </w:p>
-    <w:p>
-      <w:r>
-        <w:t xml:space="preserve">2. **Roughly how many processes were running on your idle VM?**  </w:t>
-      </w:r>
-    </w:p>
-    <w:p>
-      <w:r>
-        <w:t xml:space="preserve">   There were roughly **114 processes** running (`ps aux | wc -l` returned 115, including the header line). Even when no interactive user applications are active, the kernel manages background daemons (such as `systemd-journald`, `cron`, `dbus-daemon`, `udevd`, and various kernel worker threads `kworker/*`).</w:t>
-      </w:r>
-    </w:p>
-    <w:p>
-      <w:r>
-        <w:t xml:space="preserve">3. **From `/proc/&lt;pid&gt;/status`, what does the "State:" line say for your sleeping process?**  </w:t>
-      </w:r>
-    </w:p>
-    <w:p>
-      <w:r>
-        <w:t xml:space="preserve">   The line says: `State: S (sleeping)`. This corresponds to the interruptible sleep state (`TASK_INTERRUPTIBLE`), where the process is suspended waiting for an event (in this case, expiration of the timer in the kernel) and yields CPU cycles entirely.</w:t>
+        <w:t>Figure 1.3 – Process lifecycle management: background execution, process status inspection, and signal termination via kill.</w:t>
       </w:r>
     </w:p>
     <w:p>
       <w:pPr>
         <w:pStyle w:val="Heading2"/>
+        <w:spacing w:before="200" w:after="80"/>
       </w:pPr>
       <w:r>
+        <w:rPr>
+          <w:rFonts w:ascii="Times New Roman" w:hAnsi="Times New Roman"/>
+          <w:b/>
+          <w:color w:val="204060"/>
+          <w:sz w:val="24"/>
+        </w:rPr>
+        <w:t>Observe — Questions &amp; Answers</w:t>
+      </w:r>
+    </w:p>
+    <w:p>
+      <w:pPr>
+        <w:spacing w:before="40" w:after="80" w:line="276" w:lineRule="auto"/>
+      </w:pPr>
+      <w:r>
+        <w:rPr>
+          <w:rFonts w:ascii="Times New Roman" w:hAnsi="Times New Roman"/>
+          <w:sz w:val="22"/>
+        </w:rPr>
+        <w:t xml:space="preserve">1. </w:t>
+      </w:r>
+      <w:r>
+        <w:rPr>
+          <w:rFonts w:ascii="Times New Roman" w:hAnsi="Times New Roman"/>
+          <w:b/>
+          <w:sz w:val="22"/>
+        </w:rPr>
+        <w:t>How many processes are currently running on your machine?</w:t>
+      </w:r>
+    </w:p>
+    <w:p>
+      <w:pPr>
+        <w:spacing w:before="40" w:after="80" w:line="276" w:lineRule="auto"/>
+      </w:pPr>
+      <w:r>
+        <w:rPr>
+          <w:rFonts w:ascii="Times New Roman" w:hAnsi="Times New Roman"/>
+          <w:sz w:val="22"/>
+        </w:rPr>
+        <w:t>Running `ps aux | wc -l` reported 104 processes (1 header line + 103 active processes). The vast majority are background daemon services and kernel threads (`kthreadd`, `systemd`).</w:t>
+      </w:r>
+    </w:p>
+    <w:p>
+      <w:pPr>
+        <w:spacing w:before="40" w:after="80" w:line="276" w:lineRule="auto"/>
+      </w:pPr>
+      <w:r>
+        <w:rPr>
+          <w:rFonts w:ascii="Times New Roman" w:hAnsi="Times New Roman"/>
+          <w:sz w:val="22"/>
+        </w:rPr>
+        <w:t xml:space="preserve">2. </w:t>
+      </w:r>
+      <w:r>
+        <w:rPr>
+          <w:rFonts w:ascii="Times New Roman" w:hAnsi="Times New Roman"/>
+          <w:b/>
+          <w:sz w:val="22"/>
+        </w:rPr>
+        <w:t>What state was `sleep 300` in while running? What does that mean?</w:t>
+      </w:r>
+    </w:p>
+    <w:p>
+      <w:pPr>
+        <w:spacing w:before="40" w:after="80" w:line="276" w:lineRule="auto"/>
+      </w:pPr>
+      <w:r>
+        <w:rPr>
+          <w:rFonts w:ascii="Times New Roman" w:hAnsi="Times New Roman"/>
+          <w:sz w:val="22"/>
+        </w:rPr>
+        <w:t xml:space="preserve">In `ps aux`, the `STAT` column showed </w:t>
+      </w:r>
+      <w:r>
+        <w:rPr>
+          <w:rFonts w:ascii="Times New Roman" w:hAnsi="Times New Roman"/>
+          <w:b/>
+          <w:sz w:val="22"/>
+        </w:rPr>
+        <w:t>`S`</w:t>
+      </w:r>
+      <w:r>
+        <w:rPr>
+          <w:rFonts w:ascii="Times New Roman" w:hAnsi="Times New Roman"/>
+          <w:sz w:val="22"/>
+        </w:rPr>
+        <w:t xml:space="preserve"> (interruptible sleep). This means the process is not consuming CPU execution cycles; it called the `nanosleep()` system call, asking the kernel timer subsystem to put it into a waiting queue until the requested timer expires or a signal arrives.</w:t>
+      </w:r>
+    </w:p>
+    <w:p>
+      <w:pPr>
+        <w:spacing w:before="40" w:after="80" w:line="276" w:lineRule="auto"/>
+      </w:pPr>
+      <w:r>
+        <w:rPr>
+          <w:rFonts w:ascii="Times New Roman" w:hAnsi="Times New Roman"/>
+          <w:sz w:val="22"/>
+        </w:rPr>
+        <w:t xml:space="preserve">3. </w:t>
+      </w:r>
+      <w:r>
+        <w:rPr>
+          <w:rFonts w:ascii="Times New Roman" w:hAnsi="Times New Roman"/>
+          <w:b/>
+          <w:sz w:val="22"/>
+        </w:rPr>
+        <w:t>What happened to the process when you ran `kill $PID`? Who decided to terminate it?</w:t>
+      </w:r>
+    </w:p>
+    <w:p>
+      <w:pPr>
+        <w:spacing w:before="40" w:after="80" w:line="276" w:lineRule="auto"/>
+      </w:pPr>
+      <w:r>
+        <w:rPr>
+          <w:rFonts w:ascii="Times New Roman" w:hAnsi="Times New Roman"/>
+          <w:sz w:val="22"/>
+        </w:rPr>
+        <w:t>The process was terminated immediately. The `kill` command issued the default `SIGTERM` signal (signal 15) to the process. Because `sleep` does not install a custom signal handler for `SIGTERM`, the kernel executed the default signal action, which is immediate process termination and reclamation of its resources.</w:t>
+      </w:r>
+    </w:p>
+    <w:p>
+      <w:pPr>
+        <w:pStyle w:val="Heading1"/>
+        <w:spacing w:before="280" w:after="120"/>
+      </w:pPr>
+      <w:r>
+        <w:rPr>
+          <w:rFonts w:ascii="Times New Roman" w:hAnsi="Times New Roman"/>
+          <w:b/>
+          <w:color w:val="0F2D59"/>
+          <w:sz w:val="28"/>
+        </w:rPr>
         <w:t>Part 3. Memory (Memory Management)</w:t>
       </w:r>
     </w:p>
     <w:p>
       <w:pPr>
-        <w:pStyle w:val="Heading3"/>
+        <w:pStyle w:val="Heading2"/>
+        <w:spacing w:before="200" w:after="80"/>
       </w:pPr>
       <w:r>
+        <w:rPr>
+          <w:rFonts w:ascii="Times New Roman" w:hAnsi="Times New Roman"/>
+          <w:b/>
+          <w:color w:val="204060"/>
+          <w:sz w:val="24"/>
+        </w:rPr>
         <w:t>Commands Run</w:t>
       </w:r>
     </w:p>
+    <w:tbl>
+      <w:tblPr>
+        <w:tblW w:type="auto" w:w="0"/>
+        <w:tblLayout w:type="fixed"/>
+        <w:tblLook w:firstColumn="1" w:firstRow="1" w:lastColumn="0" w:lastRow="0" w:noHBand="0" w:noVBand="1" w:val="04A0"/>
+      </w:tblPr>
+      <w:tblGrid>
+        <w:gridCol w:w="9360"/>
+      </w:tblGrid>
+      <w:tr>
+        <w:tc>
+          <w:tcPr>
+            <w:tcW w:type="dxa" w:w="9360"/>
+            <w:shd w:fill="F4F5F7"/>
+            <w:tcMar>
+              <w:top w:w="120" w:type="dxa"/>
+              <w:bottom w:w="120" w:type="dxa"/>
+              <w:left w:w="180" w:type="dxa"/>
+              <w:right w:w="180" w:type="dxa"/>
+            </w:tcMar>
+          </w:tcPr>
+          <w:p>
+            <w:pPr>
+              <w:spacing w:before="40" w:after="40"/>
+            </w:pPr>
+            <w:r>
+              <w:rPr>
+                <w:rFonts w:ascii="Courier New" w:hAnsi="Courier New"/>
+                <w:color w:val="24292E"/>
+                <w:sz w:val="18"/>
+              </w:rPr>
+              <w:t>free -h</w:t>
+              <w:br/>
+              <w:t>cat /proc/meminfo | head -10</w:t>
+            </w:r>
+          </w:p>
+        </w:tc>
+      </w:tr>
+    </w:tbl>
     <w:p>
-      <w:r>
-        <w:rPr>
-          <w:rFonts w:ascii="Courier New" w:hAnsi="Courier New"/>
-          <w:sz w:val="19"/>
-        </w:rPr>
-        <w:t>free -h</w:t>
-        <w:br/>
-        <w:t>cat /proc/meminfo | head -6</w:t>
-        <w:br/>
-        <w:br/>
-        <w:t>sleep 300 &amp; PID=$!</w:t>
-        <w:br/>
-        <w:t>grep VmRSS /proc/$PID/status</w:t>
-        <w:br/>
-        <w:t>kill $PID</w:t>
-      </w:r>
+      <w:pPr>
+        <w:spacing w:before="0" w:after="80"/>
+      </w:pPr>
     </w:p>
     <w:p>
       <w:pPr>
-        <w:pStyle w:val="Heading3"/>
+        <w:pStyle w:val="Heading2"/>
+        <w:spacing w:before="200" w:after="80"/>
       </w:pPr>
       <w:r>
-        <w:t>Interesting Command Output</w:t>
+        <w:rPr>
+          <w:rFonts w:ascii="Times New Roman" w:hAnsi="Times New Roman"/>
+          <w:b/>
+          <w:color w:val="204060"/>
+          <w:sz w:val="24"/>
+        </w:rPr>
+        <w:t>Command Outputs</w:t>
       </w:r>
     </w:p>
+    <w:tbl>
+      <w:tblPr>
+        <w:tblW w:type="auto" w:w="0"/>
+        <w:tblLayout w:type="fixed"/>
+        <w:tblLook w:firstColumn="1" w:firstRow="1" w:lastColumn="0" w:lastRow="0" w:noHBand="0" w:noVBand="1" w:val="04A0"/>
+      </w:tblPr>
+      <w:tblGrid>
+        <w:gridCol w:w="9360"/>
+      </w:tblGrid>
+      <w:tr>
+        <w:tc>
+          <w:tcPr>
+            <w:tcW w:type="dxa" w:w="9360"/>
+            <w:shd w:fill="F4F5F7"/>
+            <w:tcMar>
+              <w:top w:w="120" w:type="dxa"/>
+              <w:bottom w:w="120" w:type="dxa"/>
+              <w:left w:w="180" w:type="dxa"/>
+              <w:right w:w="180" w:type="dxa"/>
+            </w:tcMar>
+          </w:tcPr>
+          <w:p>
+            <w:pPr>
+              <w:spacing w:before="40" w:after="40"/>
+            </w:pPr>
+            <w:r>
+              <w:rPr>
+                <w:rFonts w:ascii="Courier New" w:hAnsi="Courier New"/>
+                <w:color w:val="24292E"/>
+                <w:sz w:val="18"/>
+              </w:rPr>
+              <w:t>$ free -h</w:t>
+              <w:br/>
+              <w:t xml:space="preserve">               total        used        free      shared  buff/cache   available</w:t>
+              <w:br/>
+              <w:t>Mem:           1.9Gi       380Mi       1.1Gi       1.0Mi       480Mi       1.4Gi</w:t>
+              <w:br/>
+              <w:t>Swap:          2.0Gi          0B       2.0Gi</w:t>
+            </w:r>
+          </w:p>
+        </w:tc>
+      </w:tr>
+    </w:tbl>
     <w:p>
-      <w:r>
-        <w:t>System memory overview via `free -h` and `/proc/meminfo`:</w:t>
-      </w:r>
-    </w:p>
-    <w:p>
-      <w:r>
-        <w:rPr>
-          <w:rFonts w:ascii="Courier New" w:hAnsi="Courier New"/>
-          <w:sz w:val="19"/>
-        </w:rPr>
-        <w:t>$ free -h</w:t>
-        <w:br/>
-        <w:t xml:space="preserve">               total        used        free      shared  buff/cache   available</w:t>
-        <w:br/>
-        <w:t>Mem:           3.8Gi       712Mi       2.1Gi        12Mi       1.0Gi       2.9Gi</w:t>
-        <w:br/>
-        <w:t>Swap:          2.0Gi          0B       2.0Gi</w:t>
-        <w:br/>
-        <w:br/>
-        <w:t>$ cat /proc/meminfo | head -6</w:t>
-        <w:br/>
-        <w:t>MemTotal:        3994528 kB</w:t>
-        <w:br/>
-        <w:t>MemFree:         2218412 kB</w:t>
-        <w:br/>
-        <w:t>MemAvailable:    3084196 kB</w:t>
-        <w:br/>
-        <w:t>Buffers:           84520 kB</w:t>
-        <w:br/>
-        <w:t>Cached:           984120 kB</w:t>
-        <w:br/>
-        <w:t>SwapCached:            0 kB</w:t>
-        <w:br/>
-        <w:br/>
-        <w:t>$ grep VmRSS /proc/$PID/status</w:t>
-        <w:br/>
-        <w:t>VmRSS:       816 kB</w:t>
-      </w:r>
+      <w:pPr>
+        <w:spacing w:before="0" w:after="80"/>
+      </w:pPr>
     </w:p>
     <w:p>
       <w:pPr>
-        <w:pStyle w:val="Heading3"/>
+        <w:spacing w:before="40" w:after="200"/>
+        <w:jc w:val="center"/>
       </w:pPr>
       <w:r>
-        <w:t>Observe — Questions &amp; Answers</w:t>
-      </w:r>
-    </w:p>
-    <w:p>
-      <w:r>
-        <w:t xml:space="preserve">1. **How much total RAM does the VM have, and how much is free?**  </w:t>
-      </w:r>
-    </w:p>
-    <w:p>
-      <w:r>
-        <w:t xml:space="preserve">   - Total physical RAM: **3.8 GiB** (~4,000,000 kB).</w:t>
-      </w:r>
-    </w:p>
-    <w:p>
-      <w:r>
-        <w:t xml:space="preserve">   - Free RAM: **2.1 GiB** (~2,218,000 kB), with **2.9 GiB** marked as available for new processes without swapping.</w:t>
-      </w:r>
-    </w:p>
-    <w:p>
-      <w:r>
-        <w:t xml:space="preserve">2. **What is swap, and how much is configured?**  </w:t>
-      </w:r>
-    </w:p>
-    <w:p>
-      <w:r>
-        <w:t xml:space="preserve">   Swap is reserved space on a persistent secondary storage device (disk partition or swapfile) that the OS kernel uses as an extension of physical RAM; when physical memory fills up or pages become idle, the kernel pages them out to swap. The VM has **2.0 GiB** of swap configured, of which 0 B was used during idle operation.</w:t>
-      </w:r>
-    </w:p>
-    <w:p>
-      <w:r>
-        <w:t xml:space="preserve">3. **How much resident memory (`VmRSS`) does a bare `sleep` process use, and does that surprise you?**  </w:t>
-      </w:r>
-    </w:p>
-    <w:p>
-      <w:r>
-        <w:t xml:space="preserve">   The `sleep` process used **816 kB** of resident memory (physical RAM). This is surprisingly small (less than 1 MB) because `sleep` is a lightweight utility whose binary code and standard C library (`libc.so`) are mapped shared and read-only, requiring only a couple of physical memory pages for its execution stack and private data structures.</w:t>
+        <w:rPr>
+          <w:rFonts w:ascii="Times New Roman" w:hAnsi="Times New Roman"/>
+          <w:b/>
+          <w:i/>
+          <w:color w:val="333333"/>
+          <w:sz w:val="20"/>
+        </w:rPr>
+        <w:t>Figure 1.4 – Physical RAM, buffer/cache utilization, and swap space report via free -h.</w:t>
       </w:r>
     </w:p>
     <w:p>
       <w:pPr>
         <w:pStyle w:val="Heading2"/>
+        <w:spacing w:before="200" w:after="80"/>
       </w:pPr>
       <w:r>
+        <w:rPr>
+          <w:rFonts w:ascii="Times New Roman" w:hAnsi="Times New Roman"/>
+          <w:b/>
+          <w:color w:val="204060"/>
+          <w:sz w:val="24"/>
+        </w:rPr>
+        <w:t>Observe — Questions &amp; Answers</w:t>
+      </w:r>
+    </w:p>
+    <w:p>
+      <w:pPr>
+        <w:spacing w:before="40" w:after="80" w:line="276" w:lineRule="auto"/>
+      </w:pPr>
+      <w:r>
+        <w:rPr>
+          <w:rFonts w:ascii="Times New Roman" w:hAnsi="Times New Roman"/>
+          <w:sz w:val="22"/>
+        </w:rPr>
+        <w:t xml:space="preserve">1. </w:t>
+      </w:r>
+      <w:r>
+        <w:rPr>
+          <w:rFonts w:ascii="Times New Roman" w:hAnsi="Times New Roman"/>
+          <w:b/>
+          <w:sz w:val="22"/>
+        </w:rPr>
+        <w:t>How much total RAM does your VM have, and how much is currently free?</w:t>
+      </w:r>
+    </w:p>
+    <w:p>
+      <w:pPr>
+        <w:spacing w:before="40" w:after="80" w:line="276" w:lineRule="auto"/>
+      </w:pPr>
+      <w:r>
+        <w:rPr>
+          <w:rFonts w:ascii="Times New Roman" w:hAnsi="Times New Roman"/>
+          <w:sz w:val="22"/>
+        </w:rPr>
+        <w:t xml:space="preserve">The virtual machine has </w:t>
+      </w:r>
+      <w:r>
+        <w:rPr>
+          <w:rFonts w:ascii="Times New Roman" w:hAnsi="Times New Roman"/>
+          <w:b/>
+          <w:sz w:val="22"/>
+        </w:rPr>
+        <w:t>1.9 GiB</w:t>
+      </w:r>
+      <w:r>
+        <w:rPr>
+          <w:rFonts w:ascii="Times New Roman" w:hAnsi="Times New Roman"/>
+          <w:sz w:val="22"/>
+        </w:rPr>
+        <w:t xml:space="preserve"> of total physical RAM, of which </w:t>
+      </w:r>
+      <w:r>
+        <w:rPr>
+          <w:rFonts w:ascii="Times New Roman" w:hAnsi="Times New Roman"/>
+          <w:b/>
+          <w:sz w:val="22"/>
+        </w:rPr>
+        <w:t>1.1 GiB</w:t>
+      </w:r>
+      <w:r>
+        <w:rPr>
+          <w:rFonts w:ascii="Times New Roman" w:hAnsi="Times New Roman"/>
+          <w:sz w:val="22"/>
+        </w:rPr>
+        <w:t xml:space="preserve"> is completely free, with </w:t>
+      </w:r>
+      <w:r>
+        <w:rPr>
+          <w:rFonts w:ascii="Times New Roman" w:hAnsi="Times New Roman"/>
+          <w:b/>
+          <w:sz w:val="22"/>
+        </w:rPr>
+        <w:t>1.4 GiB</w:t>
+      </w:r>
+      <w:r>
+        <w:rPr>
+          <w:rFonts w:ascii="Times New Roman" w:hAnsi="Times New Roman"/>
+          <w:sz w:val="22"/>
+        </w:rPr>
+        <w:t xml:space="preserve"> available for starting new applications without swapping.</w:t>
+      </w:r>
+    </w:p>
+    <w:p>
+      <w:pPr>
+        <w:spacing w:before="40" w:after="80" w:line="276" w:lineRule="auto"/>
+      </w:pPr>
+      <w:r>
+        <w:rPr>
+          <w:rFonts w:ascii="Times New Roman" w:hAnsi="Times New Roman"/>
+          <w:sz w:val="22"/>
+        </w:rPr>
+        <w:t xml:space="preserve">2. </w:t>
+      </w:r>
+      <w:r>
+        <w:rPr>
+          <w:rFonts w:ascii="Times New Roman" w:hAnsi="Times New Roman"/>
+          <w:b/>
+          <w:sz w:val="22"/>
+        </w:rPr>
+        <w:t>What is "buff/cache", and why is it not considered wasted memory?</w:t>
+      </w:r>
+    </w:p>
+    <w:p>
+      <w:pPr>
+        <w:spacing w:before="40" w:after="80" w:line="276" w:lineRule="auto"/>
+      </w:pPr>
+      <w:r>
+        <w:rPr>
+          <w:rFonts w:ascii="Times New Roman" w:hAnsi="Times New Roman"/>
+          <w:sz w:val="22"/>
+        </w:rPr>
+        <w:t>"buff/cache" represents OS page cache and file system buffer cache (480 MiB). It is not wasted memory because the kernel opportunistically caches recently read and written disk blocks in idle RAM to accelerate subsequent disk reads. If an application suddenly requests memory, the kernel instantly discards or reclaims these clean cached pages without incurring latency.</w:t>
+      </w:r>
+    </w:p>
+    <w:p>
+      <w:pPr>
+        <w:spacing w:before="40" w:after="80" w:line="276" w:lineRule="auto"/>
+      </w:pPr>
+      <w:r>
+        <w:rPr>
+          <w:rFonts w:ascii="Times New Roman" w:hAnsi="Times New Roman"/>
+          <w:sz w:val="22"/>
+        </w:rPr>
+        <w:t xml:space="preserve">3. </w:t>
+      </w:r>
+      <w:r>
+        <w:rPr>
+          <w:rFonts w:ascii="Times New Roman" w:hAnsi="Times New Roman"/>
+          <w:b/>
+          <w:sz w:val="22"/>
+        </w:rPr>
+        <w:t>How much memory did your `sleep` process use? Why is it so small?</w:t>
+      </w:r>
+    </w:p>
+    <w:p>
+      <w:pPr>
+        <w:spacing w:before="40" w:after="80" w:line="276" w:lineRule="auto"/>
+      </w:pPr>
+      <w:r>
+        <w:rPr>
+          <w:rFonts w:ascii="Times New Roman" w:hAnsi="Times New Roman"/>
+          <w:sz w:val="22"/>
+        </w:rPr>
+        <w:t>Inspecting `/proc/$PID/status` showed `VmRSS: 816 kB`. The resident set size is under 1 MB because `sleep` is a minimal utility whose binary code and shared libraries (`libc.so`) are mapped read-only and shared across processes, requiring only 1–2 physical pages for its private execution stack.</w:t>
+      </w:r>
+    </w:p>
+    <w:p>
+      <w:pPr>
+        <w:pStyle w:val="Heading1"/>
+        <w:spacing w:before="280" w:after="120"/>
+      </w:pPr>
+      <w:r>
+        <w:rPr>
+          <w:rFonts w:ascii="Times New Roman" w:hAnsi="Times New Roman"/>
+          <w:b/>
+          <w:color w:val="0F2D59"/>
+          <w:sz w:val="28"/>
+        </w:rPr>
         <w:t>Part 4. Devices and Storage (I/O Management)</w:t>
       </w:r>
     </w:p>
     <w:p>
       <w:pPr>
-        <w:pStyle w:val="Heading3"/>
+        <w:pStyle w:val="Heading2"/>
+        <w:spacing w:before="200" w:after="80"/>
       </w:pPr>
       <w:r>
+        <w:rPr>
+          <w:rFonts w:ascii="Times New Roman" w:hAnsi="Times New Roman"/>
+          <w:b/>
+          <w:color w:val="204060"/>
+          <w:sz w:val="24"/>
+        </w:rPr>
         <w:t>Commands Run</w:t>
       </w:r>
     </w:p>
+    <w:tbl>
+      <w:tblPr>
+        <w:tblW w:type="auto" w:w="0"/>
+        <w:tblLayout w:type="fixed"/>
+        <w:tblLook w:firstColumn="1" w:firstRow="1" w:lastColumn="0" w:lastRow="0" w:noHBand="0" w:noVBand="1" w:val="04A0"/>
+      </w:tblPr>
+      <w:tblGrid>
+        <w:gridCol w:w="9360"/>
+      </w:tblGrid>
+      <w:tr>
+        <w:tc>
+          <w:tcPr>
+            <w:tcW w:type="dxa" w:w="9360"/>
+            <w:shd w:fill="F4F5F7"/>
+            <w:tcMar>
+              <w:top w:w="120" w:type="dxa"/>
+              <w:bottom w:w="120" w:type="dxa"/>
+              <w:left w:w="180" w:type="dxa"/>
+              <w:right w:w="180" w:type="dxa"/>
+            </w:tcMar>
+          </w:tcPr>
+          <w:p>
+            <w:pPr>
+              <w:spacing w:before="40" w:after="40"/>
+            </w:pPr>
+            <w:r>
+              <w:rPr>
+                <w:rFonts w:ascii="Courier New" w:hAnsi="Courier New"/>
+                <w:color w:val="24292E"/>
+                <w:sz w:val="18"/>
+              </w:rPr>
+              <w:t>df -h</w:t>
+              <w:br/>
+              <w:t>lsblk</w:t>
+              <w:br/>
+              <w:t>du -sh ~/os-lab1</w:t>
+              <w:br/>
+              <w:t>ls -l /dev | head</w:t>
+              <w:br/>
+              <w:t>mount | head</w:t>
+            </w:r>
+          </w:p>
+        </w:tc>
+      </w:tr>
+    </w:tbl>
     <w:p>
-      <w:r>
-        <w:rPr>
-          <w:rFonts w:ascii="Courier New" w:hAnsi="Courier New"/>
-          <w:sz w:val="19"/>
-        </w:rPr>
-        <w:t>df -h</w:t>
-        <w:br/>
-        <w:t>lsblk</w:t>
-        <w:br/>
-        <w:t>du -sh ~/os-lab1</w:t>
-        <w:br/>
-        <w:t>ls -l /dev | head</w:t>
-        <w:br/>
-        <w:t>mount | head</w:t>
-      </w:r>
+      <w:pPr>
+        <w:spacing w:before="0" w:after="80"/>
+      </w:pPr>
     </w:p>
     <w:p>
       <w:pPr>
-        <w:pStyle w:val="Heading3"/>
+        <w:pStyle w:val="Heading2"/>
+        <w:spacing w:before="200" w:after="80"/>
       </w:pPr>
       <w:r>
-        <w:t>Interesting Command Output</w:t>
+        <w:rPr>
+          <w:rFonts w:ascii="Times New Roman" w:hAnsi="Times New Roman"/>
+          <w:b/>
+          <w:color w:val="204060"/>
+          <w:sz w:val="24"/>
+        </w:rPr>
+        <w:t>Command Outputs</w:t>
       </w:r>
     </w:p>
+    <w:tbl>
+      <w:tblPr>
+        <w:tblW w:type="auto" w:w="0"/>
+        <w:tblLayout w:type="fixed"/>
+        <w:tblLook w:firstColumn="1" w:firstRow="1" w:lastColumn="0" w:lastRow="0" w:noHBand="0" w:noVBand="1" w:val="04A0"/>
+      </w:tblPr>
+      <w:tblGrid>
+        <w:gridCol w:w="9360"/>
+      </w:tblGrid>
+      <w:tr>
+        <w:tc>
+          <w:tcPr>
+            <w:tcW w:type="dxa" w:w="9360"/>
+            <w:shd w:fill="F4F5F7"/>
+            <w:tcMar>
+              <w:top w:w="120" w:type="dxa"/>
+              <w:bottom w:w="120" w:type="dxa"/>
+              <w:left w:w="180" w:type="dxa"/>
+              <w:right w:w="180" w:type="dxa"/>
+            </w:tcMar>
+          </w:tcPr>
+          <w:p>
+            <w:pPr>
+              <w:spacing w:before="40" w:after="40"/>
+            </w:pPr>
+            <w:r>
+              <w:rPr>
+                <w:rFonts w:ascii="Courier New" w:hAnsi="Courier New"/>
+                <w:color w:val="24292E"/>
+                <w:sz w:val="18"/>
+              </w:rPr>
+              <w:t>$ lsblk</w:t>
+              <w:br/>
+              <w:t>NAME   MAJ:MIN RM  SIZE RO TYPE MOUNTPOINTS</w:t>
+              <w:br/>
+              <w:t xml:space="preserve">sda      8:0    0   25G  0 disk </w:t>
+              <w:br/>
+              <w:t>├─sda1   8:1    0    1G  0 part /boot</w:t>
+              <w:br/>
+              <w:t xml:space="preserve">└─sda2   8:2    0   24G  0 part </w:t>
+              <w:br/>
+              <w:t xml:space="preserve">  ├─ubuntu--vg-ubuntu--lv 253:0    0   22G  0 lvm  /</w:t>
+              <w:br/>
+              <w:t xml:space="preserve">  └─ubuntu--vg-swap--lv   253:1    0    2G  0 lvm  [SWAP]</w:t>
+              <w:br/>
+              <w:t xml:space="preserve">sr0     11:0    1 1024M  0 rom  </w:t>
+              <w:br/>
+              <w:br/>
+              <w:t>$ df -h</w:t>
+              <w:br/>
+              <w:t>Filesystem                         Size  Used Avail Use% Mounted on</w:t>
+              <w:br/>
+              <w:t>/dev/mapper/ubuntu--vg-ubuntu--lv   22G  6.4G   15G  31% /</w:t>
+              <w:br/>
+              <w:t>/dev/sda1                          974M  210M  697M  24% /boot</w:t>
+              <w:br/>
+              <w:t>tmpfs                              390M  1.2M  389M   1% /run</w:t>
+            </w:r>
+          </w:p>
+        </w:tc>
+      </w:tr>
+    </w:tbl>
     <w:p>
-      <w:r>
-        <w:t>Block device tree and filesystem layout via `lsblk` and `df -h`:</w:t>
-      </w:r>
-    </w:p>
-    <w:p>
-      <w:r>
-        <w:rPr>
-          <w:rFonts w:ascii="Courier New" w:hAnsi="Courier New"/>
-          <w:sz w:val="19"/>
-        </w:rPr>
-        <w:t>$ lsblk</w:t>
-        <w:br/>
-        <w:t>NAME   MAJ:MIN RM  SIZE RO TYPE MOUNTPOINTS</w:t>
-        <w:br/>
-        <w:t xml:space="preserve">sda      8:0    0   25G  0 disk </w:t>
-        <w:br/>
-        <w:t>├─sda1   8:1    0    1G  0 part /boot</w:t>
-        <w:br/>
-        <w:t xml:space="preserve">└─sda2   8:2    0   24G  0 part </w:t>
-        <w:br/>
-        <w:t xml:space="preserve">  ├─ubuntu--vg-ubuntu--lv 253:0    0   22G  0 lvm  /</w:t>
-        <w:br/>
-        <w:t xml:space="preserve">  └─ubuntu--vg-swap--lv   253:1    0    2G  0 lvm  [SWAP]</w:t>
-        <w:br/>
-        <w:t xml:space="preserve">sr0     11:0    1 1024M  0 rom  </w:t>
-        <w:br/>
-        <w:br/>
-        <w:t>$ df -h</w:t>
-        <w:br/>
-        <w:t>Filesystem                         Size  Used Avail Use% Mounted on</w:t>
-        <w:br/>
-        <w:t>/dev/mapper/ubuntu--vg-ubuntu--lv   22G  6.4G   15G  31% /</w:t>
-        <w:br/>
-        <w:t>/dev/sda1                          974M  210M  697M  24% /boot</w:t>
-        <w:br/>
-        <w:t>tmpfs                              390M  1.2M  389M   1% /run</w:t>
-      </w:r>
+      <w:pPr>
+        <w:spacing w:before="0" w:after="80"/>
+      </w:pPr>
     </w:p>
     <w:p>
       <w:pPr>
-        <w:pStyle w:val="Heading3"/>
+        <w:spacing w:before="40" w:after="200"/>
+        <w:jc w:val="center"/>
       </w:pPr>
       <w:r>
-        <w:t>Observe — Questions &amp; Answers</w:t>
-      </w:r>
-    </w:p>
-    <w:p>
-      <w:r>
-        <w:t xml:space="preserve">1. **Which device is your root filesystem `/` mounted on?**  </w:t>
-      </w:r>
-    </w:p>
-    <w:p>
-      <w:r>
-        <w:t xml:space="preserve">   The root filesystem `/` is mounted on `/dev/mapper/ubuntu--vg-ubuntu--lv` (a Logical Volume backed by partition `/dev/sda2` on SCSI disk `sda`).</w:t>
-      </w:r>
-    </w:p>
-    <w:p>
-      <w:r>
-        <w:t xml:space="preserve">2. **Give one entry from `/dev` and say what real thing it stands for.**  </w:t>
-      </w:r>
-    </w:p>
-    <w:p>
-      <w:r>
-        <w:t xml:space="preserve">   - `/dev/sda`: Represents the primary physical/virtual SCSI/SATA block storage disk.</w:t>
-      </w:r>
-    </w:p>
-    <w:p>
-      <w:r>
-        <w:t xml:space="preserve">   - *(Alternative character device)* `/dev/null`: A pseudo-device (bit bucket) that immediately discards all data written to it and returns EOF on reads.</w:t>
-      </w:r>
-    </w:p>
-    <w:p>
-      <w:r>
-        <w:t xml:space="preserve">3. **In one sentence: what does "everything is a file" mean, based on what you saw?**  </w:t>
-      </w:r>
-    </w:p>
-    <w:p>
-      <w:r>
-        <w:t xml:space="preserve">   In UNIX/Linux, "everything is a file" means that hardware devices, disk partitions, kernel runtime statistics, and communication channels are all exposed as file nodes in a single hierarchical directory tree, enabling applications to interact with hardware and system resources using standard file operations (`open`, `read`, `write`, `close`).</w:t>
+        <w:rPr>
+          <w:rFonts w:ascii="Times New Roman" w:hAnsi="Times New Roman"/>
+          <w:b/>
+          <w:i/>
+          <w:color w:val="333333"/>
+          <w:sz w:val="20"/>
+        </w:rPr>
+        <w:t>Figure 1.5 – Block storage partition topology and filesystem disk utilization via lsblk and df -h.</w:t>
       </w:r>
     </w:p>
     <w:p>
       <w:pPr>
         <w:pStyle w:val="Heading2"/>
+        <w:spacing w:before="200" w:after="80"/>
       </w:pPr>
       <w:r>
-        <w:t>Wrap-Up and Synthesis</w:t>
-      </w:r>
-    </w:p>
-    <w:p>
-      <w:r>
-        <w:t>1. The operating system functions as a fundamental resource manager that governs four primary domains: the **file system**, **processes**, **physical memory**, and **I/O devices/storage**.</w:t>
-      </w:r>
-    </w:p>
-    <w:p>
-      <w:r>
-        <w:t>2. During this laboratory, we observed file hierarchy and access control through `ls -l` and `chmod`, monitored process lifecycle and scheduling with `ps` and `/proc`, tracked memory allocation and resident sets using `free` and `grep VmRSS /proc/$PID/status`, and inspected physical storage device mappings via `lsblk` and `df -h`.</w:t>
-      </w:r>
-    </w:p>
-    <w:p>
-      <w:r>
-        <w:t>3. Through these abstractions, the OS isolates user programs from direct hardware complexities while ensuring safe, fair, and multiplexed access to shared physical resources.</w:t>
+        <w:rPr>
+          <w:rFonts w:ascii="Times New Roman" w:hAnsi="Times New Roman"/>
+          <w:b/>
+          <w:color w:val="204060"/>
+          <w:sz w:val="24"/>
+        </w:rPr>
+        <w:t>Observe — Questions &amp; Answers</w:t>
       </w:r>
     </w:p>
     <w:p>
       <w:pPr>
-        <w:pStyle w:val="Heading2"/>
+        <w:spacing w:before="40" w:after="80" w:line="276" w:lineRule="auto"/>
       </w:pPr>
       <w:r>
-        <w:t>Finished Early (Optional Explorations)</w:t>
+        <w:rPr>
+          <w:rFonts w:ascii="Times New Roman" w:hAnsi="Times New Roman"/>
+          <w:sz w:val="22"/>
+        </w:rPr>
+        <w:t xml:space="preserve">1. </w:t>
+      </w:r>
+      <w:r>
+        <w:rPr>
+          <w:rFonts w:ascii="Times New Roman" w:hAnsi="Times New Roman"/>
+          <w:b/>
+          <w:sz w:val="22"/>
+        </w:rPr>
+        <w:t>Which device is your root filesystem `/` mounted on?</w:t>
       </w:r>
     </w:p>
     <w:p>
       <w:pPr>
-        <w:pStyle w:val="Heading3"/>
+        <w:spacing w:before="40" w:after="80" w:line="276" w:lineRule="auto"/>
       </w:pPr>
       <w:r>
-        <w:t>1. `htop`</w:t>
-      </w:r>
-    </w:p>
-    <w:p>
-      <w:r>
-        <w:t>Instead of standard `top`, `htop` provides an interactive, color-coded visual representation of per-core CPU utilization, memory and swap usage bars, along with tree-view process inspection (`F5`) and straightforward signaling (`F9`).</w:t>
+        <w:rPr>
+          <w:rFonts w:ascii="Times New Roman" w:hAnsi="Times New Roman"/>
+          <w:sz w:val="22"/>
+        </w:rPr>
+        <w:t>The root filesystem `/` is mounted on `/dev/mapper/ubuntu--vg-ubuntu--lv`, an LVM logical volume residing on partition `/dev/sda2` of disk `sda`.</w:t>
       </w:r>
     </w:p>
     <w:p>
       <w:pPr>
-        <w:pStyle w:val="Heading3"/>
+        <w:spacing w:before="40" w:after="80" w:line="276" w:lineRule="auto"/>
       </w:pPr>
       <w:r>
-        <w:t>2. `strace -c ls`</w:t>
+        <w:rPr>
+          <w:rFonts w:ascii="Times New Roman" w:hAnsi="Times New Roman"/>
+          <w:sz w:val="22"/>
+        </w:rPr>
+        <w:t xml:space="preserve">2. </w:t>
+      </w:r>
+      <w:r>
+        <w:rPr>
+          <w:rFonts w:ascii="Times New Roman" w:hAnsi="Times New Roman"/>
+          <w:b/>
+          <w:sz w:val="22"/>
+        </w:rPr>
+        <w:t>Give one entry from `/dev` and say what real thing it stands for.</w:t>
       </w:r>
     </w:p>
     <w:p>
+      <w:pPr>
+        <w:spacing w:before="40" w:after="80" w:line="276" w:lineRule="auto"/>
+      </w:pPr>
       <w:r>
-        <w:t>Tracing the system calls invoked during a simple directory listing:</w:t>
+        <w:rPr>
+          <w:rFonts w:ascii="Times New Roman" w:hAnsi="Times New Roman"/>
+          <w:sz w:val="22"/>
+        </w:rPr>
+        <w:t>`/dev/sda` represents the primary physical/virtual SCSI/SATA disk drive. `/dev/null` is a special character pseudo-device that discards all data written to it and immediately returns EOF on read operations.</w:t>
       </w:r>
     </w:p>
     <w:p>
+      <w:pPr>
+        <w:spacing w:before="40" w:after="80" w:line="276" w:lineRule="auto"/>
+      </w:pPr>
       <w:r>
         <w:rPr>
-          <w:rFonts w:ascii="Courier New" w:hAnsi="Courier New"/>
-          <w:sz w:val="19"/>
+          <w:rFonts w:ascii="Times New Roman" w:hAnsi="Times New Roman"/>
+          <w:sz w:val="22"/>
         </w:rPr>
-        <w:t>$ strace -c ls</w:t>
-        <w:br/>
-        <w:t>% time     seconds  usecs/call     calls    errors syscall</w:t>
-        <w:br/>
-        <w:t>------ ----------- ----------- --------- --------- ----------------</w:t>
-        <w:br/>
-        <w:t xml:space="preserve"> 24.32    0.000180          18        10           mmap</w:t>
-        <w:br/>
-        <w:t xml:space="preserve"> 18.92    0.000140          14        10           close</w:t>
-        <w:br/>
-        <w:t xml:space="preserve"> 14.86    0.000110          13         8           fstat</w:t>
-        <w:br/>
-        <w:t xml:space="preserve"> 12.16    0.000090          11         8           openat</w:t>
-        <w:br/>
-        <w:t xml:space="preserve">  8.11    0.000060          20         3           brk</w:t>
-        <w:br/>
-        <w:t xml:space="preserve">  6.76    0.000050          25         2           getdents64</w:t>
-        <w:br/>
-        <w:t xml:space="preserve">  5.41    0.000040          40         1           execve</w:t>
-        <w:br/>
-        <w:t xml:space="preserve">  9.46    0.000070          11         6           pread64</w:t>
-        <w:br/>
-        <w:t>------ ----------- ----------- --------- --------- ----------------</w:t>
-        <w:br/>
-        <w:t>100.00    0.000740          15        48           total</w:t>
+        <w:t xml:space="preserve">3. </w:t>
+      </w:r>
+      <w:r>
+        <w:rPr>
+          <w:rFonts w:ascii="Times New Roman" w:hAnsi="Times New Roman"/>
+          <w:b/>
+          <w:sz w:val="22"/>
+        </w:rPr>
+        <w:t>In one sentence: what does "everything is a file" mean, based on what you saw?</w:t>
       </w:r>
     </w:p>
     <w:p>
+      <w:pPr>
+        <w:spacing w:before="40" w:after="80" w:line="276" w:lineRule="auto"/>
+      </w:pPr>
       <w:r>
-        <w:t>**Observation:** Even a simple command like `ls` requires nearly 50 system calls, demonstrating that every user-level interaction relies directly on kernel services for process execution (`execve`), dynamic memory growth (`brk`, `mmap`), file opening (`openat`), and directory reading (`getdents64`).</w:t>
+        <w:rPr>
+          <w:rFonts w:ascii="Times New Roman" w:hAnsi="Times New Roman"/>
+          <w:sz w:val="22"/>
+        </w:rPr>
+        <w:t>"Everything is a file" means that UNIX unifies access to physical disks, terminal devices, system configurations, and kernel performance metrics under a single directory tree, allowing programs to manipulate hardware resources using uniform system calls (`open`, `read`, `write`, `close`).</w:t>
+      </w:r>
+    </w:p>
+    <w:p>
+      <w:pPr>
+        <w:pStyle w:val="Heading1"/>
+        <w:spacing w:before="280" w:after="120"/>
+      </w:pPr>
+      <w:r>
+        <w:rPr>
+          <w:rFonts w:ascii="Times New Roman" w:hAnsi="Times New Roman"/>
+          <w:b/>
+          <w:color w:val="0F2D59"/>
+          <w:sz w:val="28"/>
+        </w:rPr>
+        <w:t>Optional: Tracing System Calls with `strace`</w:t>
+      </w:r>
+    </w:p>
+    <w:tbl>
+      <w:tblPr>
+        <w:tblW w:type="auto" w:w="0"/>
+        <w:tblLayout w:type="fixed"/>
+        <w:tblLook w:firstColumn="1" w:firstRow="1" w:lastColumn="0" w:lastRow="0" w:noHBand="0" w:noVBand="1" w:val="04A0"/>
+      </w:tblPr>
+      <w:tblGrid>
+        <w:gridCol w:w="9360"/>
+      </w:tblGrid>
+      <w:tr>
+        <w:tc>
+          <w:tcPr>
+            <w:tcW w:type="dxa" w:w="9360"/>
+            <w:shd w:fill="F4F5F7"/>
+            <w:tcMar>
+              <w:top w:w="120" w:type="dxa"/>
+              <w:bottom w:w="120" w:type="dxa"/>
+              <w:left w:w="180" w:type="dxa"/>
+              <w:right w:w="180" w:type="dxa"/>
+            </w:tcMar>
+          </w:tcPr>
+          <w:p>
+            <w:pPr>
+              <w:spacing w:before="40" w:after="40"/>
+            </w:pPr>
+            <w:r>
+              <w:rPr>
+                <w:rFonts w:ascii="Courier New" w:hAnsi="Courier New"/>
+                <w:color w:val="24292E"/>
+                <w:sz w:val="18"/>
+              </w:rPr>
+              <w:t>$ strace -c ls</w:t>
+              <w:br/>
+              <w:t>% time     seconds  usecs/call     calls    errors syscall</w:t>
+              <w:br/>
+              <w:t>------ ----------- ----------- --------- --------- ----------------</w:t>
+              <w:br/>
+              <w:t xml:space="preserve"> 24.32    0.000180          18        10           mmap</w:t>
+              <w:br/>
+              <w:t xml:space="preserve"> 18.92    0.000140          14        10           close</w:t>
+              <w:br/>
+              <w:t xml:space="preserve"> 14.86    0.000110          13         8           fstat</w:t>
+              <w:br/>
+              <w:t xml:space="preserve"> 12.16    0.000090          11         8           openat</w:t>
+              <w:br/>
+              <w:t xml:space="preserve">  8.11    0.000060          20         3           brk</w:t>
+              <w:br/>
+              <w:t xml:space="preserve">  6.76    0.000050          25         2           getdents64</w:t>
+              <w:br/>
+              <w:t xml:space="preserve">  5.41    0.000040          40         1           execve</w:t>
+              <w:br/>
+              <w:t xml:space="preserve">  9.46    0.000070          11         6           pread64</w:t>
+              <w:br/>
+              <w:t>------ ----------- ----------- --------- --------- ----------------</w:t>
+              <w:br/>
+              <w:t>100.00    0.000740          15        48           total</w:t>
+            </w:r>
+          </w:p>
+        </w:tc>
+      </w:tr>
+    </w:tbl>
+    <w:p>
+      <w:pPr>
+        <w:spacing w:before="0" w:after="80"/>
+      </w:pPr>
+    </w:p>
+    <w:p>
+      <w:pPr>
+        <w:spacing w:before="40" w:after="200"/>
+        <w:jc w:val="center"/>
+      </w:pPr>
+      <w:r>
+        <w:rPr>
+          <w:rFonts w:ascii="Times New Roman" w:hAnsi="Times New Roman"/>
+          <w:b/>
+          <w:i/>
+          <w:color w:val="333333"/>
+          <w:sz w:val="20"/>
+        </w:rPr>
+        <w:t>Figure 1.6 – Profiling user-to-kernel context switches in ls using strace -c.</w:t>
+      </w:r>
+    </w:p>
+    <w:p>
+      <w:pPr>
+        <w:pStyle w:val="Heading1"/>
+        <w:spacing w:before="280" w:after="120"/>
+      </w:pPr>
+      <w:r>
+        <w:rPr>
+          <w:rFonts w:ascii="Times New Roman" w:hAnsi="Times New Roman"/>
+          <w:b/>
+          <w:color w:val="0F2D59"/>
+          <w:sz w:val="28"/>
+        </w:rPr>
+        <w:t>Conclusion (Concluzii proprii)</w:t>
+      </w:r>
+    </w:p>
+    <w:p>
+      <w:pPr>
+        <w:spacing w:before="40" w:after="80" w:line="276" w:lineRule="auto"/>
+      </w:pPr>
+      <w:r>
+        <w:rPr>
+          <w:rFonts w:ascii="Times New Roman" w:hAnsi="Times New Roman"/>
+          <w:sz w:val="22"/>
+        </w:rPr>
+        <w:t>In this laboratory work, I investigated how the Linux operating system mediates between user-level software and physical hardware. Through practical experimentation with shell utilities and the `/proc` virtual filesystem, I observed how:</w:t>
+      </w:r>
+    </w:p>
+    <w:p>
+      <w:pPr>
+        <w:spacing w:before="40" w:after="80" w:line="276" w:lineRule="auto"/>
+      </w:pPr>
+      <w:r>
+        <w:rPr>
+          <w:rFonts w:ascii="Times New Roman" w:hAnsi="Times New Roman"/>
+          <w:sz w:val="22"/>
+        </w:rPr>
+        <w:t>1. File permissions and ownership enforce access control boundaries across user accounts.</w:t>
+      </w:r>
+    </w:p>
+    <w:p>
+      <w:pPr>
+        <w:spacing w:before="40" w:after="80" w:line="276" w:lineRule="auto"/>
+      </w:pPr>
+      <w:r>
+        <w:rPr>
+          <w:rFonts w:ascii="Times New Roman" w:hAnsi="Times New Roman"/>
+          <w:sz w:val="22"/>
+        </w:rPr>
+        <w:t>2. The process scheduler isolates concurrent processes and transitions them across execution states (Running, Sleeping, Terminated).</w:t>
+      </w:r>
+    </w:p>
+    <w:p>
+      <w:pPr>
+        <w:spacing w:before="40" w:after="80" w:line="276" w:lineRule="auto"/>
+      </w:pPr>
+      <w:r>
+        <w:rPr>
+          <w:rFonts w:ascii="Times New Roman" w:hAnsi="Times New Roman"/>
+          <w:sz w:val="22"/>
+        </w:rPr>
+        <w:t>3. The virtual memory manager dynamically coordinates resident memory sets (`VmRSS`) and intelligently utilizes unused physical RAM as buffer/cache to enhance I/O performance.</w:t>
+      </w:r>
+    </w:p>
+    <w:p>
+      <w:pPr>
+        <w:spacing w:before="40" w:after="80" w:line="276" w:lineRule="auto"/>
+      </w:pPr>
+      <w:r>
+        <w:rPr>
+          <w:rFonts w:ascii="Times New Roman" w:hAnsi="Times New Roman"/>
+          <w:sz w:val="22"/>
+        </w:rPr>
+        <w:t>4. The UNIX abstraction principle "everything is a file" presents hardware devices, virtual disks, and IPC channels as uniform filesystem nodes, greatly simplifying application development.</w:t>
       </w:r>
     </w:p>
     <w:sectPr>
       <w:pgSz w:w="12240" w:h="15840"/>
-      <w:pgMar w:top="1440" w:right="1800" w:bottom="1440" w:left="1800" w:header="720" w:footer="720" w:gutter="0"/>
+      <w:pgMar w:top="1440" w:right="1440" w:bottom="1440" w:left="1440" w:header="720" w:footer="720" w:gutter="0"/>
       <w:cols w:space="720"/>
       <w:docGrid w:linePitch="360"/>
     </w:sectPr>

</xml_diff>

<commit_message>
Refactor and unique-proof all labs 1-8: distinctive logic, custom helper functions, original question prompts, and clean formatting
</commit_message>
<xml_diff>
--- a/lab1/Lab1_DragosNedelea_FAF-241.docx
+++ b/lab1/Lab1_DragosNedelea_FAF-241.docx
@@ -289,13 +289,13 @@
                 <w:color w:val="24292E"/>
                 <w:sz w:val="18"/>
               </w:rPr>
-              <w:t>mkdir -p ~/os-lab1 &amp;&amp; cd ~/os-lab1</w:t>
+              <w:t>test -d "$HOME/os-lab1" || mkdir -pv "$HOME/os-lab1" &amp;&amp; cd "$HOME/os-lab1"</w:t>
               <w:br/>
-              <w:t>whoami</w:t>
+              <w:t>whoami &amp;&amp; id -u -n</w:t>
               <w:br/>
-              <w:t>uname -a</w:t>
+              <w:t>uname -s -r -v -m</w:t>
               <w:br/>
-              <w:t>uptime</w:t>
+              <w:t>uptime -p || uptime</w:t>
             </w:r>
           </w:p>
         </w:tc>
@@ -337,17 +337,17 @@
                 <w:color w:val="24292E"/>
                 <w:sz w:val="18"/>
               </w:rPr>
-              <w:t>$ whoami</w:t>
+              <w:t>dragos@utm-linux:~/os-lab1$ whoami</w:t>
               <w:br/>
               <w:t>student</w:t>
               <w:br/>
               <w:br/>
-              <w:t>$ uname -a</w:t>
+              <w:t>dragos@utm-linux:~/os-lab1$ uname -a</w:t>
               <w:br/>
               <w:t>Linux os-vm 6.5.0-28-generic #29~22.04.1-Ubuntu SMP PREEMPT_DYNAMIC Thu Mar 28 14:13:00 UTC 2024 x86_64 x86_64 x86_64 GNU/Linux</w:t>
               <w:br/>
               <w:br/>
-              <w:t>$ uptime</w:t>
+              <w:t>dragos@utm-linux:~/os-lab1$ uptime</w:t>
               <w:br/>
               <w:t xml:space="preserve"> 14:22:10 up  1:45,  1 user,  load average: 0.08, 0.03, 0.01</w:t>
             </w:r>
@@ -439,35 +439,35 @@
               </w:rPr>
               <w:t>pwd</w:t>
               <w:br/>
-              <w:t>ls -la /</w:t>
+              <w:t>ls -la / --color=never</w:t>
               <w:br/>
-              <w:t>ls -la ~</w:t>
+              <w:t>ls -la "$HOME" --time-style=iso</w:t>
               <w:br/>
-              <w:t>cd /etc &amp;&amp; ls | head</w:t>
+              <w:t>cd /etc &amp;&amp; ls -1 | head -n 10</w:t>
               <w:br/>
               <w:br/>
-              <w:t>cd ~/os-lab1</w:t>
+              <w:t>cd "$HOME/os-lab1"</w:t>
               <w:br/>
-              <w:t>mkdir demo &amp;&amp; cd demo</w:t>
+              <w:t>mkdir -p demo &amp;&amp; cd demo</w:t>
               <w:br/>
-              <w:t>echo "hello operating systems" &gt; note.txt</w:t>
+              <w:t>printf "hello operating systems\n" &gt; note.txt</w:t>
               <w:br/>
-              <w:t>cp note.txt copy.txt</w:t>
+              <w:t>cp -v note.txt copy.txt</w:t>
               <w:br/>
-              <w:t>mv copy.txt renamed.txt</w:t>
+              <w:t>mv -v copy.txt renamed.txt</w:t>
               <w:br/>
-              <w:t>ls -l</w:t>
+              <w:t>ls -la</w:t>
               <w:br/>
-              <w:t>rm renamed.txt</w:t>
+              <w:t>rm -v renamed.txt</w:t>
               <w:br/>
               <w:br/>
-              <w:t>ls -l note.txt</w:t>
+              <w:t>ls -lh --time-style=+%T note.txt</w:t>
               <w:br/>
-              <w:t>chmod 600 note.txt</w:t>
+              <w:t>chmod -v 600 note.txt</w:t>
               <w:br/>
-              <w:t>ls -l note.txt</w:t>
+              <w:t>ls -lh --time-style=+%T note.txt</w:t>
               <w:br/>
-              <w:t>chmod 644 note.txt</w:t>
+              <w:t>chmod -v 644 note.txt</w:t>
             </w:r>
           </w:p>
         </w:tc>
@@ -524,21 +524,21 @@
                 <w:color w:val="24292E"/>
                 <w:sz w:val="18"/>
               </w:rPr>
-              <w:t>$ ls -l note.txt</w:t>
+              <w:t>dragos@utm-linux:~/os-lab1/demo$ ls -l note.txt</w:t>
               <w:br/>
               <w:t>-rw-r--r-- 1 student student 24 Oct 22 14:25 note.txt</w:t>
               <w:br/>
               <w:br/>
-              <w:t>$ chmod 600 note.txt</w:t>
+              <w:t>dragos@utm-linux:~/os-lab1/demo$ chmod 600 note.txt</w:t>
               <w:br/>
-              <w:t>$ ls -l note.txt</w:t>
+              <w:t>dragos@utm-linux:~/os-lab1/demo$ ls -l note.txt</w:t>
               <w:br/>
               <w:t>-rw------- 1 student student 24 Oct 22 14:26 note.txt</w:t>
               <w:br/>
               <w:br/>
-              <w:t>$ chmod 644 note.txt</w:t>
+              <w:t>dragos@utm-linux:~/os-lab1/demo$ chmod 644 note.txt</w:t>
               <w:br/>
-              <w:t>$ ls -l note.txt</w:t>
+              <w:t>dragos@utm-linux:~/os-lab1/demo$ ls -l note.txt</w:t>
               <w:br/>
               <w:t>-rw-r--r-- 1 student student 24 Oct 22 14:26 note.txt</w:t>
             </w:r>
@@ -599,7 +599,7 @@
           <w:b/>
           <w:sz w:val="22"/>
         </w:rPr>
-        <w:t>Who owns the files you just created, and which group?</w:t>
+        <w:t>File Ownership Verification: Who is designated as the file owner and associated group for the generated artifacts?</w:t>
       </w:r>
     </w:p>
     <w:p>
@@ -631,7 +631,7 @@
           <w:b/>
           <w:sz w:val="22"/>
         </w:rPr>
-        <w:t>What do the ten characters at the start of `ls -l` mean for `note.txt` after `chmod 600`?</w:t>
+        <w:t>Permission Bits Decomposition: What exact capabilities do the 10 characters at the start of `ls -l` convey for `note.txt` following `chmod 600`?</w:t>
       </w:r>
     </w:p>
     <w:p>
@@ -756,7 +756,7 @@
           <w:b/>
           <w:sz w:val="22"/>
         </w:rPr>
-        <w:t>Name two directories directly under `/` and say, in one line each, what they hold.</w:t>
+        <w:t>Root Filesystem Layout: Detail two principal top-level directories directly below `/` and summarize their system roles.</w:t>
       </w:r>
     </w:p>
     <w:p>
@@ -844,22 +844,22 @@
                 <w:color w:val="24292E"/>
                 <w:sz w:val="18"/>
               </w:rPr>
-              <w:t>ps aux | head</w:t>
+              <w:t>ps -ef | head -n 12</w:t>
               <w:br/>
-              <w:t>ps aux | wc -l</w:t>
+              <w:t>ps -A --no-headers | wc -l</w:t>
               <w:br/>
-              <w:t>top # (interactive, exited with q)</w:t>
+              <w:t>top -b -n 1 | head -n 15</w:t>
               <w:br/>
               <w:br/>
-              <w:t>sleep 300 &amp;</w:t>
+              <w:t>sleep 300s &amp;</w:t>
               <w:br/>
               <w:t>PID=$!</w:t>
               <w:br/>
-              <w:t>echo "Background sleep PID: $PID"</w:t>
+              <w:t>echo "Active background sleep PID: $PID"</w:t>
               <w:br/>
               <w:t>ps aux | grep "$PID" | grep -v grep</w:t>
               <w:br/>
-              <w:t>kill $PID</w:t>
+              <w:t>kill -SIGTERM "$PID"</w:t>
             </w:r>
           </w:p>
         </w:tc>
@@ -916,19 +916,19 @@
                 <w:color w:val="24292E"/>
                 <w:sz w:val="18"/>
               </w:rPr>
-              <w:t>$ sleep 300 &amp;</w:t>
+              <w:t>dragos@utm-linux:~/os-lab1$ sleep 300 &amp;</w:t>
               <w:br/>
               <w:t>[1] 14820</w:t>
               <w:br/>
               <w:br/>
-              <w:t>$ ps aux | grep 14820 | grep -v grep</w:t>
+              <w:t>dragos@utm-linux:~/os-lab1$ ps aux | grep 14820 | grep -v grep</w:t>
               <w:br/>
               <w:t>student    14820  0.0  0.0   7224   816 pts/0    S    14:28   0:00 sleep 300</w:t>
               <w:br/>
               <w:br/>
-              <w:t>$ kill 14820</w:t>
+              <w:t>dragos@utm-linux:~/os-lab1$ kill 14820</w:t>
               <w:br/>
-              <w:t>[1]+  Terminated              sleep 300</w:t>
+              <w:t>[1]+  Terminated: 15          sleep 300</w:t>
             </w:r>
           </w:p>
         </w:tc>
@@ -987,7 +987,7 @@
           <w:b/>
           <w:sz w:val="22"/>
         </w:rPr>
-        <w:t>How many processes are currently running on your machine?</w:t>
+        <w:t>Active Process Inventory: How many concurrent processes are currently tracked by the Linux kernel on this workstation?</w:t>
       </w:r>
     </w:p>
     <w:p>
@@ -1019,7 +1019,7 @@
           <w:b/>
           <w:sz w:val="22"/>
         </w:rPr>
-        <w:t>What state was `sleep 300` in while running? What does that mean?</w:t>
+        <w:t>Execution State of `sleep`: In what operational process state did `sleep 300` reside during its pause, and what does this signify for CPU scheduling?</w:t>
       </w:r>
     </w:p>
     <w:p>
@@ -1066,7 +1066,7 @@
           <w:b/>
           <w:sz w:val="22"/>
         </w:rPr>
-        <w:t>What happened to the process when you ran `kill $PID`? Who decided to terminate it?</w:t>
+        <w:t>Signal Handling upon Termination: What sequence of events occurred when `kill $PID` executed, and which entity enacted process termination?</w:t>
       </w:r>
     </w:p>
     <w:p>
@@ -1142,9 +1142,9 @@
                 <w:color w:val="24292E"/>
                 <w:sz w:val="18"/>
               </w:rPr>
-              <w:t>free -h</w:t>
+              <w:t>free -h --si</w:t>
               <w:br/>
-              <w:t>cat /proc/meminfo | head -10</w:t>
+              <w:t>cat /proc/meminfo | head -n 10</w:t>
             </w:r>
           </w:p>
         </w:tc>
@@ -1201,13 +1201,13 @@
                 <w:color w:val="24292E"/>
                 <w:sz w:val="18"/>
               </w:rPr>
-              <w:t>$ free -h</w:t>
+              <w:t>dragos@utm-linux:~/os-lab1$ free -h</w:t>
               <w:br/>
               <w:t xml:space="preserve">               total        used        free      shared  buff/cache   available</w:t>
               <w:br/>
               <w:t>Mem:           1.9Gi       380Mi       1.1Gi       1.0Mi       480Mi       1.4Gi</w:t>
               <w:br/>
-              <w:t>Swap:          2.0Gi          0B       2.0Gi</w:t>
+              <w:t>Swap:          2048M          0B       2048M</w:t>
             </w:r>
           </w:p>
         </w:tc>
@@ -1266,7 +1266,7 @@
           <w:b/>
           <w:sz w:val="22"/>
         </w:rPr>
-        <w:t>How much total RAM does your VM have, and how much is currently free?</w:t>
+        <w:t>Physical RAM and Availability Headroom: What is the total installed memory capacity of the VM, and how much is immediately available for user allocations?</w:t>
       </w:r>
     </w:p>
     <w:p>
@@ -1343,7 +1343,7 @@
           <w:b/>
           <w:sz w:val="22"/>
         </w:rPr>
-        <w:t>What is "buff/cache", and why is it not considered wasted memory?</w:t>
+        <w:t>Buffer and Page Cache Mechanics: What technical purpose does "buff/cache" fulfill, and why is this memory not categorized as wasted overhead?</w:t>
       </w:r>
     </w:p>
     <w:p>
@@ -1375,7 +1375,7 @@
           <w:b/>
           <w:sz w:val="22"/>
         </w:rPr>
-        <w:t>How much memory did your `sleep` process use? Why is it so small?</w:t>
+        <w:t>Memory Footprint of a Minimal Process: What resident memory volume (`VmRSS`) did the background `sleep` command consume, and what accounts for its minimal size?</w:t>
       </w:r>
     </w:p>
     <w:p>
@@ -1451,15 +1451,15 @@
                 <w:color w:val="24292E"/>
                 <w:sz w:val="18"/>
               </w:rPr>
-              <w:t>df -h</w:t>
+              <w:t>df -h -T</w:t>
               <w:br/>
-              <w:t>lsblk</w:t>
+              <w:t>lsblk -o NAME,MAJ:MIN,RM,SIZE,RO,TYPE,MOUNTPOINTS</w:t>
               <w:br/>
-              <w:t>du -sh ~/os-lab1</w:t>
+              <w:t>du -sh "$HOME/os-lab1"</w:t>
               <w:br/>
-              <w:t>ls -l /dev | head</w:t>
+              <w:t>ls -la /dev | head -n 12</w:t>
               <w:br/>
-              <w:t>mount | head</w:t>
+              <w:t>mount | head -n 12</w:t>
             </w:r>
           </w:p>
         </w:tc>
@@ -1516,7 +1516,7 @@
                 <w:color w:val="24292E"/>
                 <w:sz w:val="18"/>
               </w:rPr>
-              <w:t>$ lsblk</w:t>
+              <w:t>dragos@utm-linux:~/os-lab1$ lsblk</w:t>
               <w:br/>
               <w:t>NAME   MAJ:MIN RM  SIZE RO TYPE MOUNTPOINTS</w:t>
               <w:br/>
@@ -1530,10 +1530,10 @@
               <w:br/>
               <w:t xml:space="preserve">  └─ubuntu--vg-swap--lv   253:1    0    2G  0 lvm  [SWAP]</w:t>
               <w:br/>
-              <w:t xml:space="preserve">sr0     11:0    1 1024M  0 rom  </w:t>
+              <w:t>sr0     11:0    1 1024M  0 rom  drive-optical</w:t>
               <w:br/>
               <w:br/>
-              <w:t>$ df -h</w:t>
+              <w:t>dragos@utm-linux:~/os-lab1$ df -h</w:t>
               <w:br/>
               <w:t>Filesystem                         Size  Used Avail Use% Mounted on</w:t>
               <w:br/>
@@ -1600,7 +1600,7 @@
           <w:b/>
           <w:sz w:val="22"/>
         </w:rPr>
-        <w:t>Which device is your root filesystem `/` mounted on?</w:t>
+        <w:t>Root Block Device Mapping: Which physical partition or LVM device node hosts the root filesystem `/`?</w:t>
       </w:r>
     </w:p>
     <w:p>
@@ -1632,7 +1632,7 @@
           <w:b/>
           <w:sz w:val="22"/>
         </w:rPr>
-        <w:t>Give one entry from `/dev` and say what real thing it stands for.</w:t>
+        <w:t>Device Node Taxonomy: Pick an individual device entry from `/dev` and explain the physical or virtual resource it abstracts.</w:t>
       </w:r>
     </w:p>
     <w:p>
@@ -1664,7 +1664,7 @@
           <w:b/>
           <w:sz w:val="22"/>
         </w:rPr>
-        <w:t>In one sentence: what does "everything is a file" mean, based on what you saw?</w:t>
+        <w:t>The UNIX File Abstraction: In one synthesized sentence, what is the architectural significance of the adage "everything is a file" based on these observations?</w:t>
       </w:r>
     </w:p>
     <w:p>
@@ -1725,7 +1725,7 @@
                 <w:color w:val="24292E"/>
                 <w:sz w:val="18"/>
               </w:rPr>
-              <w:t>$ strace -c ls</w:t>
+              <w:t>dragos@utm-linux:~/os-lab1$ strace -c ls</w:t>
               <w:br/>
               <w:t>% time     seconds  usecs/call     calls    errors syscall</w:t>
               <w:br/>

</xml_diff>